<commit_message>
Redesign of Route Analysis, Checkpoints, and Exports
Major refactoring of route analysis for both the dog and the handler:
- Cleaning and smoothing of GPS data, trimming from First Contact to find
- New metrics: length, deviation, deviation weight, checkpoints
- More accurate calculation of checkpoints, ignoring First Contact
- Adjustment of writing/reading statistics and checkpoints in GPX
- UI, graphs, and exports use new metrics and formats
- Route rendering with a halo, improved readability
- Smoothing of routes even during video export, improved ffmpeg command
- Bug fixes, more robust processing, new rule versions (PDF/DOCX)
</commit_message>
<xml_diff>
--- a/K9TrailsAnalyzer/Resources/Competition_Rules.docx
+++ b/K9TrailsAnalyzer/Resources/Competition_Rules.docx
@@ -124,7 +124,21 @@
         <w:rPr>
           <w:lang w:val="en-GB"/>
         </w:rPr>
-        <w:t xml:space="preserve"> that save lives in the field: rapid subject location, intensity of work, and the accurate interpretation of the dog’s behavior.</w:t>
+        <w:t xml:space="preserve"> that save lives in the field: rapid subject location, intensity of work, and the accurate interpretation of the dog’s </w:t>
+      </w:r>
+      <w:proofErr w:type="spellStart"/>
+      <w:r>
+        <w:rPr>
+          <w:lang w:val="en-GB"/>
+        </w:rPr>
+        <w:t>behavior</w:t>
+      </w:r>
+      <w:proofErr w:type="spellEnd"/>
+      <w:r>
+        <w:rPr>
+          <w:lang w:val="en-GB"/>
+        </w:rPr>
+        <w:t>.</w:t>
       </w:r>
     </w:p>
     <w:p>
@@ -180,7 +194,21 @@
         <w:rPr>
           <w:lang w:val="en-GB"/>
         </w:rPr>
-        <w:t xml:space="preserve"> Eliminating judge subjectivity is complex; therefore, the evaluation is conducted via a dedicated application that analyzes GPS logs from both the trail layer and the K9 team.</w:t>
+        <w:t xml:space="preserve"> Eliminating judge subjectivity is complex; therefore, the evaluation is conducted via a dedicated application that </w:t>
+      </w:r>
+      <w:proofErr w:type="spellStart"/>
+      <w:r>
+        <w:rPr>
+          <w:lang w:val="en-GB"/>
+        </w:rPr>
+        <w:t>analyzes</w:t>
+      </w:r>
+      <w:proofErr w:type="spellEnd"/>
+      <w:r>
+        <w:rPr>
+          <w:lang w:val="en-GB"/>
+        </w:rPr>
+        <w:t xml:space="preserve"> GPS logs from both the trail layer and the K9 team.</w:t>
       </w:r>
     </w:p>
     <w:p>
@@ -194,13 +222,7 @@
         <w:rPr>
           <w:lang w:val="en-GB"/>
         </w:rPr>
-        <w:t>P</w:t>
-      </w:r>
-      <w:r>
-        <w:rPr>
-          <w:lang w:val="en-GB"/>
-        </w:rPr>
-        <w:t>rimary Evaluation Criteria</w:t>
+        <w:t>Primary Evaluation Criteria</w:t>
       </w:r>
       <w:r>
         <w:rPr>
@@ -320,7 +342,21 @@
           <w:lang w:val="en-GB"/>
         </w:rPr>
         <w:lastRenderedPageBreak/>
-        <w:t>Competitions must be double-blind — not even the judge (!!) may know the trail layer’s route. The judge monitors the handler’s work, records reported checkpoints (see below), and ends the run when the time limit is reached. After the limit expires, the handler may still report one final checkpoint.</w:t>
+        <w:t>Competitions must be double-blind — not even the judge (!!) may know the trail layer’s route. The judge monitors the handler’s work, records reported checkpoints (see below</w:t>
+      </w:r>
+      <w:proofErr w:type="gramStart"/>
+      <w:r>
+        <w:rPr>
+          <w:lang w:val="en-GB"/>
+        </w:rPr>
+        <w:t>), and</w:t>
+      </w:r>
+      <w:proofErr w:type="gramEnd"/>
+      <w:r>
+        <w:rPr>
+          <w:lang w:val="en-GB"/>
+        </w:rPr>
+        <w:t xml:space="preserve"> ends the run when the time limit is reached. After the limit expires, the handler may still report one final checkpoint.</w:t>
       </w:r>
     </w:p>
     <w:p>
@@ -445,13 +481,7 @@
         <w:rPr>
           <w:lang w:val="en-GB"/>
         </w:rPr>
-        <w:t xml:space="preserve">All trails should </w:t>
-      </w:r>
-      <w:r>
-        <w:rPr>
-          <w:lang w:val="en-GB"/>
-        </w:rPr>
-        <w:t xml:space="preserve">ideally be laid downwind or crosswind. Any items serve only as confirmation points for the handler (a checkpoint may be called at them). </w:t>
+        <w:t xml:space="preserve">All trails should ideally be laid downwind or crosswind. Any items serve only as confirmation points for the handler (a checkpoint may be called at them). </w:t>
       </w:r>
     </w:p>
     <w:p>
@@ -732,7 +762,23 @@
                 <w:szCs w:val="22"/>
                 <w:lang w:val="en-GB"/>
               </w:rPr>
-              <w:t>&lt; 10 m</w:t>
+              <w:t xml:space="preserve">&lt; </w:t>
+            </w:r>
+            <w:r>
+              <w:rPr>
+                <w:sz w:val="22"/>
+                <w:szCs w:val="22"/>
+                <w:lang w:val="en-GB"/>
+              </w:rPr>
+              <w:t>5</w:t>
+            </w:r>
+            <w:r>
+              <w:rPr>
+                <w:sz w:val="22"/>
+                <w:szCs w:val="22"/>
+                <w:lang w:val="en-GB"/>
+              </w:rPr>
+              <w:t xml:space="preserve"> m</w:t>
             </w:r>
           </w:p>
         </w:tc>
@@ -833,7 +879,15 @@
                 <w:szCs w:val="22"/>
                 <w:lang w:val="en-GB"/>
               </w:rPr>
-              <w:t>30 m</w:t>
+              <w:t>15</w:t>
+            </w:r>
+            <w:r>
+              <w:rPr>
+                <w:sz w:val="22"/>
+                <w:szCs w:val="22"/>
+                <w:lang w:val="en-GB"/>
+              </w:rPr>
+              <w:t xml:space="preserve"> m</w:t>
             </w:r>
           </w:p>
         </w:tc>
@@ -934,7 +988,15 @@
                 <w:szCs w:val="22"/>
                 <w:lang w:val="en-GB"/>
               </w:rPr>
-              <w:t>50 m and above</w:t>
+              <w:t>3</w:t>
+            </w:r>
+            <w:r>
+              <w:rPr>
+                <w:sz w:val="22"/>
+                <w:szCs w:val="22"/>
+                <w:lang w:val="en-GB"/>
+              </w:rPr>
+              <w:t>0 m and above</w:t>
             </w:r>
           </w:p>
         </w:tc>
@@ -1008,57 +1070,2074 @@
     </w:tbl>
     <w:p>
       <w:pPr>
-        <w:rPr>
-          <w:lang w:val="en-GB"/>
-        </w:rPr>
-      </w:pPr>
-    </w:p>
-    <w:p>
-      <w:pPr>
-        <w:spacing w:after="160"/>
-        <w:rPr>
-          <w:lang w:val="en-GB"/>
-        </w:rPr>
-      </w:pPr>
-      <w:r>
-        <w:rPr>
-          <w:lang w:val="en-GB"/>
-        </w:rPr>
-        <w:t xml:space="preserve">Both the proportion of the trail length where the dog works accurately and the proportion of time spent near the trail </w:t>
-      </w:r>
-      <w:r>
-        <w:rPr>
-          <w:lang w:val="en-GB"/>
-        </w:rPr>
-        <w:t>layer’s route are calculated and averaged.</w:t>
-      </w:r>
-    </w:p>
-    <w:p>
-      <w:pPr>
-        <w:spacing w:after="160"/>
-        <w:rPr>
-          <w:lang w:val="en-GB"/>
-        </w:rPr>
-      </w:pPr>
-      <w:r>
-        <w:rPr>
-          <w:lang w:val="en-GB"/>
-        </w:rPr>
-        <w:t>Examples: if the dog holds the trail to the point of find with deviation &lt; 10 m → 100 points. If working 30 m off throughout → 50 points. If working accurately but only to the halfway point → also 50 points.</w:t>
-      </w:r>
-    </w:p>
-    <w:p>
-      <w:pPr>
         <w:pStyle w:val="Nadpis2"/>
         <w:rPr>
-          <w:lang w:val="en-GB"/>
-        </w:rPr>
-      </w:pPr>
-      <w:r>
-        <w:rPr>
-          <w:lang w:val="en-GB"/>
+          <w:b w:val="0"/>
+          <w:bCs w:val="0"/>
+          <w:color w:val="auto"/>
+          <w:sz w:val="24"/>
+          <w:szCs w:val="24"/>
+        </w:rPr>
+      </w:pPr>
+      <w:proofErr w:type="spellStart"/>
+      <w:r>
+        <w:rPr>
+          <w:b w:val="0"/>
+          <w:bCs w:val="0"/>
+          <w:color w:val="auto"/>
+          <w:sz w:val="24"/>
+          <w:szCs w:val="24"/>
+        </w:rPr>
+        <w:t>For</w:t>
+      </w:r>
+      <w:proofErr w:type="spellEnd"/>
+      <w:r>
+        <w:rPr>
+          <w:b w:val="0"/>
+          <w:bCs w:val="0"/>
+          <w:color w:val="auto"/>
+          <w:sz w:val="24"/>
+          <w:szCs w:val="24"/>
+        </w:rPr>
+        <w:t xml:space="preserve"> </w:t>
+      </w:r>
+      <w:proofErr w:type="spellStart"/>
+      <w:r>
+        <w:rPr>
+          <w:b w:val="0"/>
+          <w:bCs w:val="0"/>
+          <w:color w:val="auto"/>
+          <w:sz w:val="24"/>
+          <w:szCs w:val="24"/>
+        </w:rPr>
+        <w:t>each</w:t>
+      </w:r>
+      <w:proofErr w:type="spellEnd"/>
+      <w:r>
+        <w:rPr>
+          <w:b w:val="0"/>
+          <w:bCs w:val="0"/>
+          <w:color w:val="auto"/>
+          <w:sz w:val="24"/>
+          <w:szCs w:val="24"/>
+        </w:rPr>
+        <w:t xml:space="preserve"> segment </w:t>
+      </w:r>
+      <w:proofErr w:type="spellStart"/>
+      <w:r>
+        <w:rPr>
+          <w:b w:val="0"/>
+          <w:bCs w:val="0"/>
+          <w:color w:val="auto"/>
+          <w:sz w:val="24"/>
+          <w:szCs w:val="24"/>
+        </w:rPr>
+        <w:t>of</w:t>
+      </w:r>
+      <w:proofErr w:type="spellEnd"/>
+      <w:r>
+        <w:rPr>
+          <w:b w:val="0"/>
+          <w:bCs w:val="0"/>
+          <w:color w:val="auto"/>
+          <w:sz w:val="24"/>
+          <w:szCs w:val="24"/>
+        </w:rPr>
+        <w:t xml:space="preserve"> </w:t>
+      </w:r>
+      <w:proofErr w:type="spellStart"/>
+      <w:r>
+        <w:rPr>
+          <w:b w:val="0"/>
+          <w:bCs w:val="0"/>
+          <w:color w:val="auto"/>
+          <w:sz w:val="24"/>
+          <w:szCs w:val="24"/>
+        </w:rPr>
+        <w:t>the</w:t>
+      </w:r>
+      <w:proofErr w:type="spellEnd"/>
+      <w:r>
+        <w:rPr>
+          <w:b w:val="0"/>
+          <w:bCs w:val="0"/>
+          <w:color w:val="auto"/>
+          <w:sz w:val="24"/>
+          <w:szCs w:val="24"/>
+        </w:rPr>
+        <w:t xml:space="preserve"> </w:t>
+      </w:r>
+      <w:proofErr w:type="spellStart"/>
+      <w:r>
+        <w:rPr>
+          <w:b w:val="0"/>
+          <w:bCs w:val="0"/>
+          <w:color w:val="auto"/>
+          <w:sz w:val="24"/>
+          <w:szCs w:val="24"/>
+        </w:rPr>
+        <w:t>dog's</w:t>
+      </w:r>
+      <w:proofErr w:type="spellEnd"/>
+      <w:r>
+        <w:rPr>
+          <w:b w:val="0"/>
+          <w:bCs w:val="0"/>
+          <w:color w:val="auto"/>
+          <w:sz w:val="24"/>
+          <w:szCs w:val="24"/>
+        </w:rPr>
+        <w:t xml:space="preserve"> track, </w:t>
+      </w:r>
+      <w:proofErr w:type="spellStart"/>
+      <w:r>
+        <w:rPr>
+          <w:b w:val="0"/>
+          <w:bCs w:val="0"/>
+          <w:color w:val="auto"/>
+          <w:sz w:val="24"/>
+          <w:szCs w:val="24"/>
+        </w:rPr>
+        <w:t>the</w:t>
+      </w:r>
+      <w:proofErr w:type="spellEnd"/>
+      <w:r>
+        <w:rPr>
+          <w:b w:val="0"/>
+          <w:bCs w:val="0"/>
+          <w:color w:val="auto"/>
+          <w:sz w:val="24"/>
+          <w:szCs w:val="24"/>
+        </w:rPr>
+        <w:t xml:space="preserve"> distance to </w:t>
+      </w:r>
+      <w:proofErr w:type="spellStart"/>
+      <w:r>
+        <w:rPr>
+          <w:b w:val="0"/>
+          <w:bCs w:val="0"/>
+          <w:color w:val="auto"/>
+          <w:sz w:val="24"/>
+          <w:szCs w:val="24"/>
+        </w:rPr>
+        <w:t>the</w:t>
+      </w:r>
+      <w:proofErr w:type="spellEnd"/>
+      <w:r>
+        <w:rPr>
+          <w:b w:val="0"/>
+          <w:bCs w:val="0"/>
+          <w:color w:val="auto"/>
+          <w:sz w:val="24"/>
+          <w:szCs w:val="24"/>
+        </w:rPr>
+        <w:t xml:space="preserve"> </w:t>
+      </w:r>
+      <w:proofErr w:type="spellStart"/>
+      <w:r>
+        <w:rPr>
+          <w:b w:val="0"/>
+          <w:bCs w:val="0"/>
+          <w:color w:val="auto"/>
+          <w:sz w:val="24"/>
+          <w:szCs w:val="24"/>
+        </w:rPr>
+        <w:t>nearest</w:t>
+      </w:r>
+      <w:proofErr w:type="spellEnd"/>
+      <w:r>
+        <w:rPr>
+          <w:b w:val="0"/>
+          <w:bCs w:val="0"/>
+          <w:color w:val="auto"/>
+          <w:sz w:val="24"/>
+          <w:szCs w:val="24"/>
+        </w:rPr>
+        <w:t xml:space="preserve"> point on </w:t>
+      </w:r>
+      <w:proofErr w:type="spellStart"/>
+      <w:r>
+        <w:rPr>
+          <w:b w:val="0"/>
+          <w:bCs w:val="0"/>
+          <w:color w:val="auto"/>
+          <w:sz w:val="24"/>
+          <w:szCs w:val="24"/>
+        </w:rPr>
+        <w:t>the</w:t>
+      </w:r>
+      <w:proofErr w:type="spellEnd"/>
+      <w:r>
+        <w:rPr>
+          <w:b w:val="0"/>
+          <w:bCs w:val="0"/>
+          <w:color w:val="auto"/>
+          <w:sz w:val="24"/>
+          <w:szCs w:val="24"/>
+        </w:rPr>
+        <w:t xml:space="preserve"> </w:t>
+      </w:r>
+      <w:proofErr w:type="spellStart"/>
+      <w:r>
+        <w:rPr>
+          <w:b w:val="0"/>
+          <w:bCs w:val="0"/>
+          <w:color w:val="auto"/>
+          <w:sz w:val="24"/>
+          <w:szCs w:val="24"/>
+        </w:rPr>
+        <w:t>trail</w:t>
+      </w:r>
+      <w:proofErr w:type="spellEnd"/>
+      <w:r>
+        <w:rPr>
+          <w:b w:val="0"/>
+          <w:bCs w:val="0"/>
+          <w:color w:val="auto"/>
+          <w:sz w:val="24"/>
+          <w:szCs w:val="24"/>
+        </w:rPr>
+        <w:t xml:space="preserve"> </w:t>
+      </w:r>
+      <w:proofErr w:type="spellStart"/>
+      <w:r>
+        <w:rPr>
+          <w:b w:val="0"/>
+          <w:bCs w:val="0"/>
+          <w:color w:val="auto"/>
+          <w:sz w:val="24"/>
+          <w:szCs w:val="24"/>
+        </w:rPr>
+        <w:t>layer's</w:t>
+      </w:r>
+      <w:proofErr w:type="spellEnd"/>
+      <w:r>
+        <w:rPr>
+          <w:b w:val="0"/>
+          <w:bCs w:val="0"/>
+          <w:color w:val="auto"/>
+          <w:sz w:val="24"/>
+          <w:szCs w:val="24"/>
+        </w:rPr>
+        <w:t xml:space="preserve"> </w:t>
+      </w:r>
+      <w:proofErr w:type="spellStart"/>
+      <w:r>
+        <w:rPr>
+          <w:b w:val="0"/>
+          <w:bCs w:val="0"/>
+          <w:color w:val="auto"/>
+          <w:sz w:val="24"/>
+          <w:szCs w:val="24"/>
+        </w:rPr>
+        <w:t>route</w:t>
+      </w:r>
+      <w:proofErr w:type="spellEnd"/>
+      <w:r>
+        <w:rPr>
+          <w:b w:val="0"/>
+          <w:bCs w:val="0"/>
+          <w:color w:val="auto"/>
+          <w:sz w:val="24"/>
+          <w:szCs w:val="24"/>
+        </w:rPr>
+        <w:t xml:space="preserve"> </w:t>
+      </w:r>
+      <w:proofErr w:type="spellStart"/>
+      <w:r>
+        <w:rPr>
+          <w:b w:val="0"/>
+          <w:bCs w:val="0"/>
+          <w:color w:val="auto"/>
+          <w:sz w:val="24"/>
+          <w:szCs w:val="24"/>
+        </w:rPr>
+        <w:t>is</w:t>
+      </w:r>
+      <w:proofErr w:type="spellEnd"/>
+      <w:r>
+        <w:rPr>
+          <w:b w:val="0"/>
+          <w:bCs w:val="0"/>
+          <w:color w:val="auto"/>
+          <w:sz w:val="24"/>
+          <w:szCs w:val="24"/>
+        </w:rPr>
+        <w:t xml:space="preserve"> </w:t>
+      </w:r>
+      <w:proofErr w:type="spellStart"/>
+      <w:r>
+        <w:rPr>
+          <w:b w:val="0"/>
+          <w:bCs w:val="0"/>
+          <w:color w:val="auto"/>
+          <w:sz w:val="24"/>
+          <w:szCs w:val="24"/>
+        </w:rPr>
+        <w:t>calculated</w:t>
+      </w:r>
+      <w:proofErr w:type="spellEnd"/>
+      <w:r>
+        <w:rPr>
+          <w:b w:val="0"/>
+          <w:bCs w:val="0"/>
+          <w:color w:val="auto"/>
+          <w:sz w:val="24"/>
+          <w:szCs w:val="24"/>
+        </w:rPr>
+        <w:t xml:space="preserve">, and a </w:t>
+      </w:r>
+      <w:proofErr w:type="spellStart"/>
+      <w:r>
+        <w:rPr>
+          <w:b w:val="0"/>
+          <w:bCs w:val="0"/>
+          <w:color w:val="auto"/>
+          <w:sz w:val="24"/>
+          <w:szCs w:val="24"/>
+        </w:rPr>
+        <w:t>weight</w:t>
+      </w:r>
+      <w:proofErr w:type="spellEnd"/>
+      <w:r>
+        <w:rPr>
+          <w:b w:val="0"/>
+          <w:bCs w:val="0"/>
+          <w:color w:val="auto"/>
+          <w:sz w:val="24"/>
+          <w:szCs w:val="24"/>
+        </w:rPr>
+        <w:t xml:space="preserve"> </w:t>
+      </w:r>
+      <w:proofErr w:type="spellStart"/>
+      <w:r>
+        <w:rPr>
+          <w:b w:val="0"/>
+          <w:bCs w:val="0"/>
+          <w:color w:val="auto"/>
+          <w:sz w:val="24"/>
+          <w:szCs w:val="24"/>
+        </w:rPr>
+        <w:t>function</w:t>
+      </w:r>
+      <w:proofErr w:type="spellEnd"/>
+      <w:r>
+        <w:rPr>
+          <w:b w:val="0"/>
+          <w:bCs w:val="0"/>
+          <w:color w:val="auto"/>
+          <w:sz w:val="24"/>
+          <w:szCs w:val="24"/>
+        </w:rPr>
+        <w:t xml:space="preserve"> </w:t>
+      </w:r>
+      <w:r>
+        <w:rPr>
+          <w:b w:val="0"/>
+          <w:bCs w:val="0"/>
+          <w:i/>
+          <w:iCs/>
+          <w:color w:val="auto"/>
+          <w:sz w:val="24"/>
+          <w:szCs w:val="24"/>
+        </w:rPr>
+        <w:t>w</w:t>
+      </w:r>
+      <w:r>
+        <w:rPr>
+          <w:b w:val="0"/>
+          <w:bCs w:val="0"/>
+          <w:color w:val="auto"/>
+          <w:sz w:val="24"/>
+          <w:szCs w:val="24"/>
+        </w:rPr>
+        <w:t xml:space="preserve"> </w:t>
+      </w:r>
+      <w:proofErr w:type="spellStart"/>
+      <w:r>
+        <w:rPr>
+          <w:b w:val="0"/>
+          <w:bCs w:val="0"/>
+          <w:color w:val="auto"/>
+          <w:sz w:val="24"/>
+          <w:szCs w:val="24"/>
+        </w:rPr>
+        <w:t>is</w:t>
+      </w:r>
+      <w:proofErr w:type="spellEnd"/>
+      <w:r>
+        <w:rPr>
+          <w:b w:val="0"/>
+          <w:bCs w:val="0"/>
+          <w:color w:val="auto"/>
+          <w:sz w:val="24"/>
+          <w:szCs w:val="24"/>
+        </w:rPr>
+        <w:t xml:space="preserve"> </w:t>
+      </w:r>
+      <w:proofErr w:type="spellStart"/>
+      <w:r>
+        <w:rPr>
+          <w:b w:val="0"/>
+          <w:bCs w:val="0"/>
+          <w:color w:val="auto"/>
+          <w:sz w:val="24"/>
+          <w:szCs w:val="24"/>
+        </w:rPr>
+        <w:t>applied</w:t>
+      </w:r>
+      <w:proofErr w:type="spellEnd"/>
+      <w:r>
+        <w:rPr>
+          <w:b w:val="0"/>
+          <w:bCs w:val="0"/>
+          <w:color w:val="auto"/>
+          <w:sz w:val="24"/>
+          <w:szCs w:val="24"/>
+        </w:rPr>
+        <w:t xml:space="preserve"> to </w:t>
+      </w:r>
+      <w:proofErr w:type="spellStart"/>
+      <w:r>
+        <w:rPr>
+          <w:b w:val="0"/>
+          <w:bCs w:val="0"/>
+          <w:color w:val="auto"/>
+          <w:sz w:val="24"/>
+          <w:szCs w:val="24"/>
+        </w:rPr>
+        <w:t>this</w:t>
+      </w:r>
+      <w:proofErr w:type="spellEnd"/>
+      <w:r>
+        <w:rPr>
+          <w:b w:val="0"/>
+          <w:bCs w:val="0"/>
+          <w:color w:val="auto"/>
+          <w:sz w:val="24"/>
+          <w:szCs w:val="24"/>
+        </w:rPr>
+        <w:t xml:space="preserve"> distance. </w:t>
+      </w:r>
+      <w:proofErr w:type="spellStart"/>
+      <w:r>
+        <w:rPr>
+          <w:b w:val="0"/>
+          <w:bCs w:val="0"/>
+          <w:color w:val="auto"/>
+          <w:sz w:val="24"/>
+          <w:szCs w:val="24"/>
+        </w:rPr>
+        <w:t>The</w:t>
+      </w:r>
+      <w:proofErr w:type="spellEnd"/>
+      <w:r>
+        <w:rPr>
+          <w:b w:val="0"/>
+          <w:bCs w:val="0"/>
+          <w:color w:val="auto"/>
+          <w:sz w:val="24"/>
+          <w:szCs w:val="24"/>
+        </w:rPr>
+        <w:t xml:space="preserve"> </w:t>
+      </w:r>
+      <w:proofErr w:type="spellStart"/>
+      <w:r>
+        <w:rPr>
+          <w:b w:val="0"/>
+          <w:bCs w:val="0"/>
+          <w:color w:val="auto"/>
+          <w:sz w:val="24"/>
+          <w:szCs w:val="24"/>
+        </w:rPr>
+        <w:t>resulting</w:t>
+      </w:r>
+      <w:proofErr w:type="spellEnd"/>
+      <w:r>
+        <w:rPr>
+          <w:b w:val="0"/>
+          <w:bCs w:val="0"/>
+          <w:color w:val="auto"/>
+          <w:sz w:val="24"/>
+          <w:szCs w:val="24"/>
+        </w:rPr>
+        <w:t xml:space="preserve"> </w:t>
+      </w:r>
+      <w:proofErr w:type="spellStart"/>
+      <w:r>
+        <w:rPr>
+          <w:b w:val="0"/>
+          <w:bCs w:val="0"/>
+          <w:color w:val="auto"/>
+          <w:sz w:val="24"/>
+          <w:szCs w:val="24"/>
+        </w:rPr>
+        <w:t>accuracy</w:t>
+      </w:r>
+      <w:proofErr w:type="spellEnd"/>
+      <w:r>
+        <w:rPr>
+          <w:b w:val="0"/>
+          <w:bCs w:val="0"/>
+          <w:color w:val="auto"/>
+          <w:sz w:val="24"/>
+          <w:szCs w:val="24"/>
+        </w:rPr>
+        <w:t xml:space="preserve"> </w:t>
+      </w:r>
+      <w:proofErr w:type="spellStart"/>
+      <w:r>
+        <w:rPr>
+          <w:b w:val="0"/>
+          <w:bCs w:val="0"/>
+          <w:color w:val="auto"/>
+          <w:sz w:val="24"/>
+          <w:szCs w:val="24"/>
+        </w:rPr>
+        <w:t>score</w:t>
+      </w:r>
+      <w:proofErr w:type="spellEnd"/>
+      <w:r>
+        <w:rPr>
+          <w:b w:val="0"/>
+          <w:bCs w:val="0"/>
+          <w:color w:val="auto"/>
+          <w:sz w:val="24"/>
+          <w:szCs w:val="24"/>
+        </w:rPr>
+        <w:t xml:space="preserve"> </w:t>
+      </w:r>
+      <w:proofErr w:type="spellStart"/>
+      <w:r>
+        <w:rPr>
+          <w:b w:val="0"/>
+          <w:bCs w:val="0"/>
+          <w:color w:val="auto"/>
+          <w:sz w:val="24"/>
+          <w:szCs w:val="24"/>
+        </w:rPr>
+        <w:t>is</w:t>
+      </w:r>
+      <w:proofErr w:type="spellEnd"/>
+      <w:r>
+        <w:rPr>
+          <w:b w:val="0"/>
+          <w:bCs w:val="0"/>
+          <w:color w:val="auto"/>
+          <w:sz w:val="24"/>
+          <w:szCs w:val="24"/>
+        </w:rPr>
+        <w:t xml:space="preserve"> a </w:t>
+      </w:r>
+      <w:proofErr w:type="spellStart"/>
+      <w:r>
+        <w:rPr>
+          <w:b w:val="0"/>
+          <w:bCs w:val="0"/>
+          <w:color w:val="auto"/>
+          <w:sz w:val="24"/>
+          <w:szCs w:val="24"/>
+        </w:rPr>
+        <w:t>weighted</w:t>
+      </w:r>
+      <w:proofErr w:type="spellEnd"/>
+      <w:r>
+        <w:rPr>
+          <w:b w:val="0"/>
+          <w:bCs w:val="0"/>
+          <w:color w:val="auto"/>
+          <w:sz w:val="24"/>
+          <w:szCs w:val="24"/>
+        </w:rPr>
+        <w:t xml:space="preserve"> </w:t>
+      </w:r>
+      <w:proofErr w:type="spellStart"/>
+      <w:r>
+        <w:rPr>
+          <w:b w:val="0"/>
+          <w:bCs w:val="0"/>
+          <w:color w:val="auto"/>
+          <w:sz w:val="24"/>
+          <w:szCs w:val="24"/>
+        </w:rPr>
+        <w:t>average</w:t>
+      </w:r>
+      <w:proofErr w:type="spellEnd"/>
+      <w:r>
+        <w:rPr>
+          <w:b w:val="0"/>
+          <w:bCs w:val="0"/>
+          <w:color w:val="auto"/>
+          <w:sz w:val="24"/>
+          <w:szCs w:val="24"/>
+        </w:rPr>
+        <w:t xml:space="preserve"> </w:t>
+      </w:r>
+      <w:proofErr w:type="spellStart"/>
+      <w:r>
+        <w:rPr>
+          <w:b w:val="0"/>
+          <w:bCs w:val="0"/>
+          <w:color w:val="auto"/>
+          <w:sz w:val="24"/>
+          <w:szCs w:val="24"/>
+        </w:rPr>
+        <w:t>of</w:t>
+      </w:r>
+      <w:proofErr w:type="spellEnd"/>
+      <w:r>
+        <w:rPr>
+          <w:b w:val="0"/>
+          <w:bCs w:val="0"/>
+          <w:color w:val="auto"/>
+          <w:sz w:val="24"/>
+          <w:szCs w:val="24"/>
+        </w:rPr>
+        <w:t xml:space="preserve"> these </w:t>
+      </w:r>
+      <w:proofErr w:type="spellStart"/>
+      <w:r>
+        <w:rPr>
+          <w:b w:val="0"/>
+          <w:bCs w:val="0"/>
+          <w:color w:val="auto"/>
+          <w:sz w:val="24"/>
+          <w:szCs w:val="24"/>
+        </w:rPr>
+        <w:t>weights</w:t>
+      </w:r>
+      <w:proofErr w:type="spellEnd"/>
+      <w:r>
+        <w:rPr>
+          <w:b w:val="0"/>
+          <w:bCs w:val="0"/>
+          <w:color w:val="auto"/>
+          <w:sz w:val="24"/>
+          <w:szCs w:val="24"/>
+        </w:rPr>
+        <w:t xml:space="preserve"> – </w:t>
+      </w:r>
+      <w:proofErr w:type="spellStart"/>
+      <w:r>
+        <w:rPr>
+          <w:b w:val="0"/>
+          <w:bCs w:val="0"/>
+          <w:color w:val="auto"/>
+          <w:sz w:val="24"/>
+          <w:szCs w:val="24"/>
+        </w:rPr>
+        <w:t>where</w:t>
+      </w:r>
+      <w:proofErr w:type="spellEnd"/>
+      <w:r>
+        <w:rPr>
+          <w:b w:val="0"/>
+          <w:bCs w:val="0"/>
+          <w:color w:val="auto"/>
+          <w:sz w:val="24"/>
+          <w:szCs w:val="24"/>
+        </w:rPr>
+        <w:t xml:space="preserve"> </w:t>
+      </w:r>
+      <w:proofErr w:type="spellStart"/>
+      <w:r>
+        <w:rPr>
+          <w:b w:val="0"/>
+          <w:bCs w:val="0"/>
+          <w:color w:val="auto"/>
+          <w:sz w:val="24"/>
+          <w:szCs w:val="24"/>
+        </w:rPr>
+        <w:t>each</w:t>
+      </w:r>
+      <w:proofErr w:type="spellEnd"/>
+      <w:r>
+        <w:rPr>
+          <w:b w:val="0"/>
+          <w:bCs w:val="0"/>
+          <w:color w:val="auto"/>
+          <w:sz w:val="24"/>
+          <w:szCs w:val="24"/>
+        </w:rPr>
+        <w:t xml:space="preserve"> segment </w:t>
+      </w:r>
+      <w:proofErr w:type="spellStart"/>
+      <w:r>
+        <w:rPr>
+          <w:b w:val="0"/>
+          <w:bCs w:val="0"/>
+          <w:color w:val="auto"/>
+          <w:sz w:val="24"/>
+          <w:szCs w:val="24"/>
+        </w:rPr>
+        <w:t>is</w:t>
+      </w:r>
+      <w:proofErr w:type="spellEnd"/>
+      <w:r>
+        <w:rPr>
+          <w:b w:val="0"/>
+          <w:bCs w:val="0"/>
+          <w:color w:val="auto"/>
+          <w:sz w:val="24"/>
+          <w:szCs w:val="24"/>
+        </w:rPr>
+        <w:t xml:space="preserve"> </w:t>
+      </w:r>
+      <w:proofErr w:type="spellStart"/>
+      <w:r>
+        <w:rPr>
+          <w:b w:val="0"/>
+          <w:bCs w:val="0"/>
+          <w:color w:val="auto"/>
+          <w:sz w:val="24"/>
+          <w:szCs w:val="24"/>
+        </w:rPr>
+        <w:t>weighted</w:t>
+      </w:r>
+      <w:proofErr w:type="spellEnd"/>
+      <w:r>
+        <w:rPr>
+          <w:b w:val="0"/>
+          <w:bCs w:val="0"/>
+          <w:color w:val="auto"/>
+          <w:sz w:val="24"/>
+          <w:szCs w:val="24"/>
+        </w:rPr>
+        <w:t xml:space="preserve"> </w:t>
+      </w:r>
+      <w:proofErr w:type="spellStart"/>
+      <w:r>
+        <w:rPr>
+          <w:b w:val="0"/>
+          <w:bCs w:val="0"/>
+          <w:color w:val="auto"/>
+          <w:sz w:val="24"/>
+          <w:szCs w:val="24"/>
+        </w:rPr>
+        <w:t>both</w:t>
+      </w:r>
+      <w:proofErr w:type="spellEnd"/>
+      <w:r>
+        <w:rPr>
+          <w:b w:val="0"/>
+          <w:bCs w:val="0"/>
+          <w:color w:val="auto"/>
+          <w:sz w:val="24"/>
+          <w:szCs w:val="24"/>
+        </w:rPr>
+        <w:t xml:space="preserve"> by </w:t>
+      </w:r>
+      <w:proofErr w:type="spellStart"/>
+      <w:r>
+        <w:rPr>
+          <w:b w:val="0"/>
+          <w:bCs w:val="0"/>
+          <w:color w:val="auto"/>
+          <w:sz w:val="24"/>
+          <w:szCs w:val="24"/>
+        </w:rPr>
+        <w:t>its</w:t>
+      </w:r>
+      <w:proofErr w:type="spellEnd"/>
+      <w:r>
+        <w:rPr>
+          <w:b w:val="0"/>
+          <w:bCs w:val="0"/>
+          <w:color w:val="auto"/>
+          <w:sz w:val="24"/>
+          <w:szCs w:val="24"/>
+        </w:rPr>
+        <w:t xml:space="preserve"> </w:t>
+      </w:r>
+      <w:proofErr w:type="spellStart"/>
+      <w:r>
+        <w:rPr>
+          <w:b w:val="0"/>
+          <w:bCs w:val="0"/>
+          <w:color w:val="auto"/>
+          <w:sz w:val="24"/>
+          <w:szCs w:val="24"/>
+        </w:rPr>
+        <w:t>length</w:t>
+      </w:r>
+      <w:proofErr w:type="spellEnd"/>
+      <w:r>
+        <w:rPr>
+          <w:b w:val="0"/>
+          <w:bCs w:val="0"/>
+          <w:color w:val="auto"/>
+          <w:sz w:val="24"/>
+          <w:szCs w:val="24"/>
+        </w:rPr>
+        <w:t xml:space="preserve"> and by </w:t>
+      </w:r>
+      <w:proofErr w:type="spellStart"/>
+      <w:r>
+        <w:rPr>
+          <w:b w:val="0"/>
+          <w:bCs w:val="0"/>
+          <w:color w:val="auto"/>
+          <w:sz w:val="24"/>
+          <w:szCs w:val="24"/>
+        </w:rPr>
+        <w:t>the</w:t>
+      </w:r>
+      <w:proofErr w:type="spellEnd"/>
+      <w:r>
+        <w:rPr>
+          <w:b w:val="0"/>
+          <w:bCs w:val="0"/>
+          <w:color w:val="auto"/>
+          <w:sz w:val="24"/>
+          <w:szCs w:val="24"/>
+        </w:rPr>
+        <w:t xml:space="preserve"> </w:t>
+      </w:r>
+      <w:proofErr w:type="spellStart"/>
+      <w:r>
+        <w:rPr>
+          <w:b w:val="0"/>
+          <w:bCs w:val="0"/>
+          <w:color w:val="auto"/>
+          <w:sz w:val="24"/>
+          <w:szCs w:val="24"/>
+        </w:rPr>
+        <w:t>time</w:t>
+      </w:r>
+      <w:proofErr w:type="spellEnd"/>
+      <w:r>
+        <w:rPr>
+          <w:b w:val="0"/>
+          <w:bCs w:val="0"/>
+          <w:color w:val="auto"/>
+          <w:sz w:val="24"/>
+          <w:szCs w:val="24"/>
+        </w:rPr>
+        <w:t xml:space="preserve"> </w:t>
+      </w:r>
+      <w:proofErr w:type="spellStart"/>
+      <w:r>
+        <w:rPr>
+          <w:b w:val="0"/>
+          <w:bCs w:val="0"/>
+          <w:color w:val="auto"/>
+          <w:sz w:val="24"/>
+          <w:szCs w:val="24"/>
+        </w:rPr>
+        <w:t>spent</w:t>
+      </w:r>
+      <w:proofErr w:type="spellEnd"/>
+      <w:r>
+        <w:rPr>
+          <w:b w:val="0"/>
+          <w:bCs w:val="0"/>
+          <w:color w:val="auto"/>
+          <w:sz w:val="24"/>
+          <w:szCs w:val="24"/>
+        </w:rPr>
+        <w:t xml:space="preserve"> </w:t>
+      </w:r>
+      <w:proofErr w:type="spellStart"/>
+      <w:r>
+        <w:rPr>
+          <w:b w:val="0"/>
+          <w:bCs w:val="0"/>
+          <w:color w:val="auto"/>
+          <w:sz w:val="24"/>
+          <w:szCs w:val="24"/>
+        </w:rPr>
+        <w:t>at</w:t>
+      </w:r>
+      <w:proofErr w:type="spellEnd"/>
+      <w:r>
+        <w:rPr>
+          <w:b w:val="0"/>
+          <w:bCs w:val="0"/>
+          <w:color w:val="auto"/>
+          <w:sz w:val="24"/>
+          <w:szCs w:val="24"/>
+        </w:rPr>
+        <w:t xml:space="preserve"> </w:t>
+      </w:r>
+      <w:proofErr w:type="spellStart"/>
+      <w:r>
+        <w:rPr>
+          <w:b w:val="0"/>
+          <w:bCs w:val="0"/>
+          <w:color w:val="auto"/>
+          <w:sz w:val="24"/>
+          <w:szCs w:val="24"/>
+        </w:rPr>
+        <w:t>that</w:t>
+      </w:r>
+      <w:proofErr w:type="spellEnd"/>
+      <w:r>
+        <w:rPr>
+          <w:b w:val="0"/>
+          <w:bCs w:val="0"/>
+          <w:color w:val="auto"/>
+          <w:sz w:val="24"/>
+          <w:szCs w:val="24"/>
+        </w:rPr>
+        <w:t xml:space="preserve"> </w:t>
+      </w:r>
+      <w:proofErr w:type="spellStart"/>
+      <w:r>
+        <w:rPr>
+          <w:b w:val="0"/>
+          <w:bCs w:val="0"/>
+          <w:color w:val="auto"/>
+          <w:sz w:val="24"/>
+          <w:szCs w:val="24"/>
+        </w:rPr>
+        <w:t>location</w:t>
+      </w:r>
+      <w:proofErr w:type="spellEnd"/>
+      <w:r>
+        <w:rPr>
+          <w:b w:val="0"/>
+          <w:bCs w:val="0"/>
+          <w:color w:val="auto"/>
+          <w:sz w:val="24"/>
+          <w:szCs w:val="24"/>
+        </w:rPr>
+        <w:t xml:space="preserve">. </w:t>
+      </w:r>
+      <w:proofErr w:type="spellStart"/>
+      <w:r>
+        <w:rPr>
+          <w:b w:val="0"/>
+          <w:bCs w:val="0"/>
+          <w:color w:val="auto"/>
+          <w:sz w:val="24"/>
+          <w:szCs w:val="24"/>
+        </w:rPr>
+        <w:t>The</w:t>
+      </w:r>
+      <w:proofErr w:type="spellEnd"/>
+      <w:r>
+        <w:rPr>
+          <w:b w:val="0"/>
+          <w:bCs w:val="0"/>
+          <w:color w:val="auto"/>
+          <w:sz w:val="24"/>
+          <w:szCs w:val="24"/>
+        </w:rPr>
+        <w:t xml:space="preserve"> </w:t>
+      </w:r>
+      <w:proofErr w:type="spellStart"/>
+      <w:r>
+        <w:rPr>
+          <w:b w:val="0"/>
+          <w:bCs w:val="0"/>
+          <w:color w:val="auto"/>
+          <w:sz w:val="24"/>
+          <w:szCs w:val="24"/>
+        </w:rPr>
+        <w:t>average</w:t>
+      </w:r>
+      <w:proofErr w:type="spellEnd"/>
+      <w:r>
+        <w:rPr>
+          <w:b w:val="0"/>
+          <w:bCs w:val="0"/>
+          <w:color w:val="auto"/>
+          <w:sz w:val="24"/>
+          <w:szCs w:val="24"/>
+        </w:rPr>
+        <w:t xml:space="preserve"> </w:t>
+      </w:r>
+      <w:proofErr w:type="spellStart"/>
+      <w:r>
+        <w:rPr>
+          <w:b w:val="0"/>
+          <w:bCs w:val="0"/>
+          <w:color w:val="auto"/>
+          <w:sz w:val="24"/>
+          <w:szCs w:val="24"/>
+        </w:rPr>
+        <w:t>of</w:t>
+      </w:r>
+      <w:proofErr w:type="spellEnd"/>
+      <w:r>
+        <w:rPr>
+          <w:b w:val="0"/>
+          <w:bCs w:val="0"/>
+          <w:color w:val="auto"/>
+          <w:sz w:val="24"/>
+          <w:szCs w:val="24"/>
+        </w:rPr>
+        <w:t xml:space="preserve"> these </w:t>
+      </w:r>
+      <w:proofErr w:type="spellStart"/>
+      <w:r>
+        <w:rPr>
+          <w:b w:val="0"/>
+          <w:bCs w:val="0"/>
+          <w:color w:val="auto"/>
+          <w:sz w:val="24"/>
+          <w:szCs w:val="24"/>
+        </w:rPr>
+        <w:t>two</w:t>
+      </w:r>
+      <w:proofErr w:type="spellEnd"/>
+      <w:r>
+        <w:rPr>
+          <w:b w:val="0"/>
+          <w:bCs w:val="0"/>
+          <w:color w:val="auto"/>
+          <w:sz w:val="24"/>
+          <w:szCs w:val="24"/>
+        </w:rPr>
+        <w:t xml:space="preserve"> </w:t>
+      </w:r>
+      <w:proofErr w:type="spellStart"/>
+      <w:r>
+        <w:rPr>
+          <w:b w:val="0"/>
+          <w:bCs w:val="0"/>
+          <w:color w:val="auto"/>
+          <w:sz w:val="24"/>
+          <w:szCs w:val="24"/>
+        </w:rPr>
+        <w:t>values</w:t>
+      </w:r>
+      <w:proofErr w:type="spellEnd"/>
+      <w:r>
+        <w:rPr>
+          <w:b w:val="0"/>
+          <w:bCs w:val="0"/>
+          <w:color w:val="auto"/>
+          <w:sz w:val="24"/>
+          <w:szCs w:val="24"/>
+        </w:rPr>
+        <w:t xml:space="preserve"> </w:t>
+      </w:r>
+      <w:proofErr w:type="spellStart"/>
+      <w:r>
+        <w:rPr>
+          <w:b w:val="0"/>
+          <w:bCs w:val="0"/>
+          <w:color w:val="auto"/>
+          <w:sz w:val="24"/>
+          <w:szCs w:val="24"/>
+        </w:rPr>
+        <w:t>forms</w:t>
+      </w:r>
+      <w:proofErr w:type="spellEnd"/>
+      <w:r>
+        <w:rPr>
+          <w:b w:val="0"/>
+          <w:bCs w:val="0"/>
+          <w:color w:val="auto"/>
+          <w:sz w:val="24"/>
+          <w:szCs w:val="24"/>
+        </w:rPr>
+        <w:t xml:space="preserve"> </w:t>
+      </w:r>
+      <w:proofErr w:type="spellStart"/>
+      <w:r>
+        <w:rPr>
+          <w:b w:val="0"/>
+          <w:bCs w:val="0"/>
+          <w:color w:val="auto"/>
+          <w:sz w:val="24"/>
+          <w:szCs w:val="24"/>
+        </w:rPr>
+        <w:t>the</w:t>
+      </w:r>
+      <w:proofErr w:type="spellEnd"/>
+      <w:r>
+        <w:rPr>
+          <w:b w:val="0"/>
+          <w:bCs w:val="0"/>
+          <w:color w:val="auto"/>
+          <w:sz w:val="24"/>
+          <w:szCs w:val="24"/>
+        </w:rPr>
+        <w:t xml:space="preserve"> </w:t>
+      </w:r>
+      <w:proofErr w:type="spellStart"/>
+      <w:r>
+        <w:rPr>
+          <w:b w:val="0"/>
+          <w:bCs w:val="0"/>
+          <w:color w:val="auto"/>
+          <w:sz w:val="24"/>
+          <w:szCs w:val="24"/>
+        </w:rPr>
+        <w:t>final</w:t>
+      </w:r>
+      <w:proofErr w:type="spellEnd"/>
+      <w:r>
+        <w:rPr>
+          <w:b w:val="0"/>
+          <w:bCs w:val="0"/>
+          <w:color w:val="auto"/>
+          <w:sz w:val="24"/>
+          <w:szCs w:val="24"/>
+        </w:rPr>
+        <w:t xml:space="preserve"> </w:t>
+      </w:r>
+      <w:proofErr w:type="spellStart"/>
+      <w:r>
+        <w:rPr>
+          <w:b w:val="0"/>
+          <w:bCs w:val="0"/>
+          <w:color w:val="auto"/>
+          <w:sz w:val="24"/>
+          <w:szCs w:val="24"/>
+        </w:rPr>
+        <w:t>score</w:t>
+      </w:r>
+      <w:proofErr w:type="spellEnd"/>
+      <w:r>
+        <w:rPr>
+          <w:b w:val="0"/>
+          <w:bCs w:val="0"/>
+          <w:color w:val="auto"/>
+          <w:sz w:val="24"/>
+          <w:szCs w:val="24"/>
+        </w:rPr>
+        <w:t xml:space="preserve">. In </w:t>
+      </w:r>
+      <w:proofErr w:type="spellStart"/>
+      <w:r>
+        <w:rPr>
+          <w:b w:val="0"/>
+          <w:bCs w:val="0"/>
+          <w:color w:val="auto"/>
+          <w:sz w:val="24"/>
+          <w:szCs w:val="24"/>
+        </w:rPr>
+        <w:t>this</w:t>
+      </w:r>
+      <w:proofErr w:type="spellEnd"/>
+      <w:r>
+        <w:rPr>
+          <w:b w:val="0"/>
+          <w:bCs w:val="0"/>
+          <w:color w:val="auto"/>
+          <w:sz w:val="24"/>
+          <w:szCs w:val="24"/>
+        </w:rPr>
+        <w:t xml:space="preserve"> </w:t>
+      </w:r>
+      <w:proofErr w:type="spellStart"/>
+      <w:r>
+        <w:rPr>
+          <w:b w:val="0"/>
+          <w:bCs w:val="0"/>
+          <w:color w:val="auto"/>
+          <w:sz w:val="24"/>
+          <w:szCs w:val="24"/>
+        </w:rPr>
+        <w:t>way</w:t>
+      </w:r>
+      <w:proofErr w:type="spellEnd"/>
+      <w:r>
+        <w:rPr>
+          <w:b w:val="0"/>
+          <w:bCs w:val="0"/>
+          <w:color w:val="auto"/>
+          <w:sz w:val="24"/>
+          <w:szCs w:val="24"/>
+        </w:rPr>
+        <w:t xml:space="preserve">, </w:t>
+      </w:r>
+      <w:proofErr w:type="spellStart"/>
+      <w:r>
+        <w:rPr>
+          <w:b w:val="0"/>
+          <w:bCs w:val="0"/>
+          <w:color w:val="auto"/>
+          <w:sz w:val="24"/>
+          <w:szCs w:val="24"/>
+        </w:rPr>
+        <w:t>large</w:t>
+      </w:r>
+      <w:proofErr w:type="spellEnd"/>
+      <w:r>
+        <w:rPr>
+          <w:b w:val="0"/>
+          <w:bCs w:val="0"/>
+          <w:color w:val="auto"/>
+          <w:sz w:val="24"/>
+          <w:szCs w:val="24"/>
+        </w:rPr>
+        <w:t xml:space="preserve"> </w:t>
+      </w:r>
+      <w:proofErr w:type="spellStart"/>
+      <w:r>
+        <w:rPr>
+          <w:b w:val="0"/>
+          <w:bCs w:val="0"/>
+          <w:color w:val="auto"/>
+          <w:sz w:val="24"/>
+          <w:szCs w:val="24"/>
+        </w:rPr>
+        <w:t>deviations</w:t>
+      </w:r>
+      <w:proofErr w:type="spellEnd"/>
+      <w:r>
+        <w:rPr>
+          <w:b w:val="0"/>
+          <w:bCs w:val="0"/>
+          <w:color w:val="auto"/>
+          <w:sz w:val="24"/>
+          <w:szCs w:val="24"/>
+        </w:rPr>
+        <w:t xml:space="preserve"> are </w:t>
+      </w:r>
+      <w:proofErr w:type="spellStart"/>
+      <w:r>
+        <w:rPr>
+          <w:b w:val="0"/>
+          <w:bCs w:val="0"/>
+          <w:color w:val="auto"/>
+          <w:sz w:val="24"/>
+          <w:szCs w:val="24"/>
+        </w:rPr>
+        <w:t>penalized</w:t>
+      </w:r>
+      <w:proofErr w:type="spellEnd"/>
+      <w:r>
+        <w:rPr>
+          <w:b w:val="0"/>
+          <w:bCs w:val="0"/>
+          <w:color w:val="auto"/>
+          <w:sz w:val="24"/>
+          <w:szCs w:val="24"/>
+        </w:rPr>
+        <w:t xml:space="preserve"> more </w:t>
+      </w:r>
+      <w:proofErr w:type="spellStart"/>
+      <w:r>
+        <w:rPr>
+          <w:b w:val="0"/>
+          <w:bCs w:val="0"/>
+          <w:color w:val="auto"/>
+          <w:sz w:val="24"/>
+          <w:szCs w:val="24"/>
+        </w:rPr>
+        <w:t>heavily</w:t>
+      </w:r>
+      <w:proofErr w:type="spellEnd"/>
+      <w:r>
+        <w:rPr>
+          <w:b w:val="0"/>
+          <w:bCs w:val="0"/>
+          <w:color w:val="auto"/>
+          <w:sz w:val="24"/>
+          <w:szCs w:val="24"/>
+        </w:rPr>
+        <w:t xml:space="preserve"> </w:t>
+      </w:r>
+      <w:proofErr w:type="spellStart"/>
+      <w:r>
+        <w:rPr>
+          <w:b w:val="0"/>
+          <w:bCs w:val="0"/>
+          <w:color w:val="auto"/>
+          <w:sz w:val="24"/>
+          <w:szCs w:val="24"/>
+        </w:rPr>
+        <w:t>than</w:t>
+      </w:r>
+      <w:proofErr w:type="spellEnd"/>
+      <w:r>
+        <w:rPr>
+          <w:b w:val="0"/>
+          <w:bCs w:val="0"/>
+          <w:color w:val="auto"/>
+          <w:sz w:val="24"/>
+          <w:szCs w:val="24"/>
+        </w:rPr>
+        <w:t xml:space="preserve"> </w:t>
+      </w:r>
+      <w:proofErr w:type="spellStart"/>
+      <w:r>
+        <w:rPr>
+          <w:b w:val="0"/>
+          <w:bCs w:val="0"/>
+          <w:color w:val="auto"/>
+          <w:sz w:val="24"/>
+          <w:szCs w:val="24"/>
+        </w:rPr>
+        <w:t>small</w:t>
+      </w:r>
+      <w:proofErr w:type="spellEnd"/>
+      <w:r>
+        <w:rPr>
+          <w:b w:val="0"/>
+          <w:bCs w:val="0"/>
+          <w:color w:val="auto"/>
+          <w:sz w:val="24"/>
+          <w:szCs w:val="24"/>
+        </w:rPr>
+        <w:t xml:space="preserve"> </w:t>
+      </w:r>
+      <w:proofErr w:type="spellStart"/>
+      <w:r>
+        <w:rPr>
+          <w:b w:val="0"/>
+          <w:bCs w:val="0"/>
+          <w:color w:val="auto"/>
+          <w:sz w:val="24"/>
+          <w:szCs w:val="24"/>
+        </w:rPr>
+        <w:t>ones</w:t>
+      </w:r>
+      <w:proofErr w:type="spellEnd"/>
+      <w:r>
+        <w:rPr>
+          <w:b w:val="0"/>
+          <w:bCs w:val="0"/>
+          <w:color w:val="auto"/>
+          <w:sz w:val="24"/>
+          <w:szCs w:val="24"/>
+        </w:rPr>
+        <w:t xml:space="preserve"> – a dog </w:t>
+      </w:r>
+      <w:proofErr w:type="spellStart"/>
+      <w:r>
+        <w:rPr>
+          <w:b w:val="0"/>
+          <w:bCs w:val="0"/>
+          <w:color w:val="auto"/>
+          <w:sz w:val="24"/>
+          <w:szCs w:val="24"/>
+        </w:rPr>
+        <w:t>that</w:t>
+      </w:r>
+      <w:proofErr w:type="spellEnd"/>
+      <w:r>
+        <w:rPr>
+          <w:b w:val="0"/>
+          <w:bCs w:val="0"/>
+          <w:color w:val="auto"/>
+          <w:sz w:val="24"/>
+          <w:szCs w:val="24"/>
+        </w:rPr>
+        <w:t xml:space="preserve"> </w:t>
+      </w:r>
+      <w:proofErr w:type="spellStart"/>
+      <w:r>
+        <w:rPr>
+          <w:b w:val="0"/>
+          <w:bCs w:val="0"/>
+          <w:color w:val="auto"/>
+          <w:sz w:val="24"/>
+          <w:szCs w:val="24"/>
+        </w:rPr>
+        <w:t>consistently</w:t>
+      </w:r>
+      <w:proofErr w:type="spellEnd"/>
+      <w:r>
+        <w:rPr>
+          <w:b w:val="0"/>
+          <w:bCs w:val="0"/>
+          <w:color w:val="auto"/>
+          <w:sz w:val="24"/>
+          <w:szCs w:val="24"/>
+        </w:rPr>
+        <w:t xml:space="preserve"> </w:t>
+      </w:r>
+      <w:proofErr w:type="spellStart"/>
+      <w:r>
+        <w:rPr>
+          <w:b w:val="0"/>
+          <w:bCs w:val="0"/>
+          <w:color w:val="auto"/>
+          <w:sz w:val="24"/>
+          <w:szCs w:val="24"/>
+        </w:rPr>
+        <w:t>stayed</w:t>
+      </w:r>
+      <w:proofErr w:type="spellEnd"/>
+      <w:r>
+        <w:rPr>
+          <w:b w:val="0"/>
+          <w:bCs w:val="0"/>
+          <w:color w:val="auto"/>
+          <w:sz w:val="24"/>
+          <w:szCs w:val="24"/>
+        </w:rPr>
+        <w:t xml:space="preserve"> 15 m </w:t>
+      </w:r>
+      <w:proofErr w:type="spellStart"/>
+      <w:r>
+        <w:rPr>
+          <w:b w:val="0"/>
+          <w:bCs w:val="0"/>
+          <w:color w:val="auto"/>
+          <w:sz w:val="24"/>
+          <w:szCs w:val="24"/>
+        </w:rPr>
+        <w:t>from</w:t>
+      </w:r>
+      <w:proofErr w:type="spellEnd"/>
+      <w:r>
+        <w:rPr>
+          <w:b w:val="0"/>
+          <w:bCs w:val="0"/>
+          <w:color w:val="auto"/>
+          <w:sz w:val="24"/>
+          <w:szCs w:val="24"/>
+        </w:rPr>
+        <w:t xml:space="preserve"> </w:t>
+      </w:r>
+      <w:proofErr w:type="spellStart"/>
+      <w:r>
+        <w:rPr>
+          <w:b w:val="0"/>
+          <w:bCs w:val="0"/>
+          <w:color w:val="auto"/>
+          <w:sz w:val="24"/>
+          <w:szCs w:val="24"/>
+        </w:rPr>
+        <w:t>the</w:t>
+      </w:r>
+      <w:proofErr w:type="spellEnd"/>
+      <w:r>
+        <w:rPr>
+          <w:b w:val="0"/>
+          <w:bCs w:val="0"/>
+          <w:color w:val="auto"/>
+          <w:sz w:val="24"/>
+          <w:szCs w:val="24"/>
+        </w:rPr>
+        <w:t xml:space="preserve"> </w:t>
+      </w:r>
+      <w:proofErr w:type="spellStart"/>
+      <w:r>
+        <w:rPr>
+          <w:b w:val="0"/>
+          <w:bCs w:val="0"/>
+          <w:color w:val="auto"/>
+          <w:sz w:val="24"/>
+          <w:szCs w:val="24"/>
         </w:rPr>
         <w:lastRenderedPageBreak/>
+        <w:t>trail</w:t>
+      </w:r>
+      <w:proofErr w:type="spellEnd"/>
+      <w:r>
+        <w:rPr>
+          <w:b w:val="0"/>
+          <w:bCs w:val="0"/>
+          <w:color w:val="auto"/>
+          <w:sz w:val="24"/>
+          <w:szCs w:val="24"/>
+        </w:rPr>
+        <w:t xml:space="preserve"> </w:t>
+      </w:r>
+      <w:proofErr w:type="spellStart"/>
+      <w:r>
+        <w:rPr>
+          <w:b w:val="0"/>
+          <w:bCs w:val="0"/>
+          <w:color w:val="auto"/>
+          <w:sz w:val="24"/>
+          <w:szCs w:val="24"/>
+        </w:rPr>
+        <w:t>scores</w:t>
+      </w:r>
+      <w:proofErr w:type="spellEnd"/>
+      <w:r>
+        <w:rPr>
+          <w:b w:val="0"/>
+          <w:bCs w:val="0"/>
+          <w:color w:val="auto"/>
+          <w:sz w:val="24"/>
+          <w:szCs w:val="24"/>
+        </w:rPr>
+        <w:t xml:space="preserve"> 50 </w:t>
+      </w:r>
+      <w:proofErr w:type="spellStart"/>
+      <w:r>
+        <w:rPr>
+          <w:b w:val="0"/>
+          <w:bCs w:val="0"/>
+          <w:color w:val="auto"/>
+          <w:sz w:val="24"/>
+          <w:szCs w:val="24"/>
+        </w:rPr>
+        <w:t>points</w:t>
+      </w:r>
+      <w:proofErr w:type="spellEnd"/>
+      <w:r>
+        <w:rPr>
+          <w:b w:val="0"/>
+          <w:bCs w:val="0"/>
+          <w:color w:val="auto"/>
+          <w:sz w:val="24"/>
+          <w:szCs w:val="24"/>
+        </w:rPr>
+        <w:t xml:space="preserve">, but a dog </w:t>
+      </w:r>
+      <w:proofErr w:type="spellStart"/>
+      <w:r>
+        <w:rPr>
+          <w:b w:val="0"/>
+          <w:bCs w:val="0"/>
+          <w:color w:val="auto"/>
+          <w:sz w:val="24"/>
+          <w:szCs w:val="24"/>
+        </w:rPr>
+        <w:t>that</w:t>
+      </w:r>
+      <w:proofErr w:type="spellEnd"/>
+      <w:r>
+        <w:rPr>
+          <w:b w:val="0"/>
+          <w:bCs w:val="0"/>
+          <w:color w:val="auto"/>
+          <w:sz w:val="24"/>
+          <w:szCs w:val="24"/>
+        </w:rPr>
+        <w:t xml:space="preserve"> </w:t>
+      </w:r>
+      <w:proofErr w:type="spellStart"/>
+      <w:r>
+        <w:rPr>
+          <w:b w:val="0"/>
+          <w:bCs w:val="0"/>
+          <w:color w:val="auto"/>
+          <w:sz w:val="24"/>
+          <w:szCs w:val="24"/>
+        </w:rPr>
+        <w:t>followed</w:t>
+      </w:r>
+      <w:proofErr w:type="spellEnd"/>
+      <w:r>
+        <w:rPr>
+          <w:b w:val="0"/>
+          <w:bCs w:val="0"/>
+          <w:color w:val="auto"/>
+          <w:sz w:val="24"/>
+          <w:szCs w:val="24"/>
+        </w:rPr>
+        <w:t xml:space="preserve"> </w:t>
+      </w:r>
+      <w:proofErr w:type="spellStart"/>
+      <w:r>
+        <w:rPr>
+          <w:b w:val="0"/>
+          <w:bCs w:val="0"/>
+          <w:color w:val="auto"/>
+          <w:sz w:val="24"/>
+          <w:szCs w:val="24"/>
+        </w:rPr>
+        <w:t>the</w:t>
+      </w:r>
+      <w:proofErr w:type="spellEnd"/>
+      <w:r>
+        <w:rPr>
+          <w:b w:val="0"/>
+          <w:bCs w:val="0"/>
+          <w:color w:val="auto"/>
+          <w:sz w:val="24"/>
+          <w:szCs w:val="24"/>
+        </w:rPr>
+        <w:t xml:space="preserve"> </w:t>
+      </w:r>
+      <w:proofErr w:type="spellStart"/>
+      <w:r>
+        <w:rPr>
+          <w:b w:val="0"/>
+          <w:bCs w:val="0"/>
+          <w:color w:val="auto"/>
+          <w:sz w:val="24"/>
+          <w:szCs w:val="24"/>
+        </w:rPr>
+        <w:t>trail</w:t>
+      </w:r>
+      <w:proofErr w:type="spellEnd"/>
+      <w:r>
+        <w:rPr>
+          <w:b w:val="0"/>
+          <w:bCs w:val="0"/>
+          <w:color w:val="auto"/>
+          <w:sz w:val="24"/>
+          <w:szCs w:val="24"/>
+        </w:rPr>
+        <w:t xml:space="preserve"> </w:t>
+      </w:r>
+      <w:proofErr w:type="spellStart"/>
+      <w:r>
+        <w:rPr>
+          <w:b w:val="0"/>
+          <w:bCs w:val="0"/>
+          <w:color w:val="auto"/>
+          <w:sz w:val="24"/>
+          <w:szCs w:val="24"/>
+        </w:rPr>
+        <w:t>perfectly</w:t>
+      </w:r>
+      <w:proofErr w:type="spellEnd"/>
+      <w:r>
+        <w:rPr>
+          <w:b w:val="0"/>
+          <w:bCs w:val="0"/>
+          <w:color w:val="auto"/>
+          <w:sz w:val="24"/>
+          <w:szCs w:val="24"/>
+        </w:rPr>
+        <w:t xml:space="preserve"> </w:t>
+      </w:r>
+      <w:proofErr w:type="spellStart"/>
+      <w:r>
+        <w:rPr>
+          <w:b w:val="0"/>
+          <w:bCs w:val="0"/>
+          <w:color w:val="auto"/>
+          <w:sz w:val="24"/>
+          <w:szCs w:val="24"/>
+        </w:rPr>
+        <w:t>for</w:t>
+      </w:r>
+      <w:proofErr w:type="spellEnd"/>
+      <w:r>
+        <w:rPr>
+          <w:b w:val="0"/>
+          <w:bCs w:val="0"/>
+          <w:color w:val="auto"/>
+          <w:sz w:val="24"/>
+          <w:szCs w:val="24"/>
+        </w:rPr>
+        <w:t xml:space="preserve"> </w:t>
+      </w:r>
+      <w:proofErr w:type="spellStart"/>
+      <w:r>
+        <w:rPr>
+          <w:b w:val="0"/>
+          <w:bCs w:val="0"/>
+          <w:color w:val="auto"/>
+          <w:sz w:val="24"/>
+          <w:szCs w:val="24"/>
+        </w:rPr>
+        <w:t>half</w:t>
+      </w:r>
+      <w:proofErr w:type="spellEnd"/>
+      <w:r>
+        <w:rPr>
+          <w:b w:val="0"/>
+          <w:bCs w:val="0"/>
+          <w:color w:val="auto"/>
+          <w:sz w:val="24"/>
+          <w:szCs w:val="24"/>
+        </w:rPr>
+        <w:t xml:space="preserve"> </w:t>
+      </w:r>
+      <w:proofErr w:type="spellStart"/>
+      <w:r>
+        <w:rPr>
+          <w:b w:val="0"/>
+          <w:bCs w:val="0"/>
+          <w:color w:val="auto"/>
+          <w:sz w:val="24"/>
+          <w:szCs w:val="24"/>
+        </w:rPr>
+        <w:t>the</w:t>
+      </w:r>
+      <w:proofErr w:type="spellEnd"/>
+      <w:r>
+        <w:rPr>
+          <w:b w:val="0"/>
+          <w:bCs w:val="0"/>
+          <w:color w:val="auto"/>
+          <w:sz w:val="24"/>
+          <w:szCs w:val="24"/>
+        </w:rPr>
+        <w:t xml:space="preserve"> </w:t>
+      </w:r>
+      <w:proofErr w:type="spellStart"/>
+      <w:r>
+        <w:rPr>
+          <w:b w:val="0"/>
+          <w:bCs w:val="0"/>
+          <w:color w:val="auto"/>
+          <w:sz w:val="24"/>
+          <w:szCs w:val="24"/>
+        </w:rPr>
+        <w:t>route</w:t>
+      </w:r>
+      <w:proofErr w:type="spellEnd"/>
+      <w:r>
+        <w:rPr>
+          <w:b w:val="0"/>
+          <w:bCs w:val="0"/>
+          <w:color w:val="auto"/>
+          <w:sz w:val="24"/>
+          <w:szCs w:val="24"/>
+        </w:rPr>
+        <w:t xml:space="preserve"> and </w:t>
+      </w:r>
+      <w:proofErr w:type="spellStart"/>
+      <w:r>
+        <w:rPr>
+          <w:b w:val="0"/>
+          <w:bCs w:val="0"/>
+          <w:color w:val="auto"/>
+          <w:sz w:val="24"/>
+          <w:szCs w:val="24"/>
+        </w:rPr>
+        <w:t>then</w:t>
+      </w:r>
+      <w:proofErr w:type="spellEnd"/>
+      <w:r>
+        <w:rPr>
+          <w:b w:val="0"/>
+          <w:bCs w:val="0"/>
+          <w:color w:val="auto"/>
+          <w:sz w:val="24"/>
+          <w:szCs w:val="24"/>
+        </w:rPr>
+        <w:t xml:space="preserve"> </w:t>
+      </w:r>
+      <w:proofErr w:type="spellStart"/>
+      <w:r>
+        <w:rPr>
+          <w:b w:val="0"/>
+          <w:bCs w:val="0"/>
+          <w:color w:val="auto"/>
+          <w:sz w:val="24"/>
+          <w:szCs w:val="24"/>
+        </w:rPr>
+        <w:t>deviated</w:t>
+      </w:r>
+      <w:proofErr w:type="spellEnd"/>
+      <w:r>
+        <w:rPr>
+          <w:b w:val="0"/>
+          <w:bCs w:val="0"/>
+          <w:color w:val="auto"/>
+          <w:sz w:val="24"/>
+          <w:szCs w:val="24"/>
+        </w:rPr>
+        <w:t xml:space="preserve"> 30 m </w:t>
+      </w:r>
+      <w:proofErr w:type="spellStart"/>
+      <w:r>
+        <w:rPr>
+          <w:b w:val="0"/>
+          <w:bCs w:val="0"/>
+          <w:color w:val="auto"/>
+          <w:sz w:val="24"/>
+          <w:szCs w:val="24"/>
+        </w:rPr>
+        <w:t>for</w:t>
+      </w:r>
+      <w:proofErr w:type="spellEnd"/>
+      <w:r>
+        <w:rPr>
+          <w:b w:val="0"/>
+          <w:bCs w:val="0"/>
+          <w:color w:val="auto"/>
+          <w:sz w:val="24"/>
+          <w:szCs w:val="24"/>
+        </w:rPr>
+        <w:t xml:space="preserve"> </w:t>
+      </w:r>
+      <w:proofErr w:type="spellStart"/>
+      <w:r>
+        <w:rPr>
+          <w:b w:val="0"/>
+          <w:bCs w:val="0"/>
+          <w:color w:val="auto"/>
+          <w:sz w:val="24"/>
+          <w:szCs w:val="24"/>
+        </w:rPr>
+        <w:t>the</w:t>
+      </w:r>
+      <w:proofErr w:type="spellEnd"/>
+      <w:r>
+        <w:rPr>
+          <w:b w:val="0"/>
+          <w:bCs w:val="0"/>
+          <w:color w:val="auto"/>
+          <w:sz w:val="24"/>
+          <w:szCs w:val="24"/>
+        </w:rPr>
+        <w:t xml:space="preserve"> </w:t>
+      </w:r>
+      <w:proofErr w:type="spellStart"/>
+      <w:r>
+        <w:rPr>
+          <w:b w:val="0"/>
+          <w:bCs w:val="0"/>
+          <w:color w:val="auto"/>
+          <w:sz w:val="24"/>
+          <w:szCs w:val="24"/>
+        </w:rPr>
+        <w:t>other</w:t>
+      </w:r>
+      <w:proofErr w:type="spellEnd"/>
+      <w:r>
+        <w:rPr>
+          <w:b w:val="0"/>
+          <w:bCs w:val="0"/>
+          <w:color w:val="auto"/>
+          <w:sz w:val="24"/>
+          <w:szCs w:val="24"/>
+        </w:rPr>
+        <w:t xml:space="preserve"> </w:t>
+      </w:r>
+      <w:proofErr w:type="spellStart"/>
+      <w:r>
+        <w:rPr>
+          <w:b w:val="0"/>
+          <w:bCs w:val="0"/>
+          <w:color w:val="auto"/>
+          <w:sz w:val="24"/>
+          <w:szCs w:val="24"/>
+        </w:rPr>
+        <w:t>half</w:t>
+      </w:r>
+      <w:proofErr w:type="spellEnd"/>
+      <w:r>
+        <w:rPr>
+          <w:b w:val="0"/>
+          <w:bCs w:val="0"/>
+          <w:color w:val="auto"/>
+          <w:sz w:val="24"/>
+          <w:szCs w:val="24"/>
+        </w:rPr>
+        <w:t xml:space="preserve"> </w:t>
+      </w:r>
+      <w:proofErr w:type="spellStart"/>
+      <w:r>
+        <w:rPr>
+          <w:b w:val="0"/>
+          <w:bCs w:val="0"/>
+          <w:color w:val="auto"/>
+          <w:sz w:val="24"/>
+          <w:szCs w:val="24"/>
+        </w:rPr>
+        <w:t>scores</w:t>
+      </w:r>
+      <w:proofErr w:type="spellEnd"/>
+      <w:r>
+        <w:rPr>
+          <w:b w:val="0"/>
+          <w:bCs w:val="0"/>
+          <w:color w:val="auto"/>
+          <w:sz w:val="24"/>
+          <w:szCs w:val="24"/>
+        </w:rPr>
+        <w:t xml:space="preserve"> </w:t>
+      </w:r>
+      <w:proofErr w:type="spellStart"/>
+      <w:r>
+        <w:rPr>
+          <w:b w:val="0"/>
+          <w:bCs w:val="0"/>
+          <w:color w:val="auto"/>
+          <w:sz w:val="24"/>
+          <w:szCs w:val="24"/>
+        </w:rPr>
+        <w:t>less</w:t>
+      </w:r>
+      <w:proofErr w:type="spellEnd"/>
+      <w:r>
+        <w:rPr>
+          <w:b w:val="0"/>
+          <w:bCs w:val="0"/>
+          <w:color w:val="auto"/>
+          <w:sz w:val="24"/>
+          <w:szCs w:val="24"/>
+        </w:rPr>
+        <w:t xml:space="preserve"> </w:t>
+      </w:r>
+      <w:proofErr w:type="spellStart"/>
+      <w:r>
+        <w:rPr>
+          <w:b w:val="0"/>
+          <w:bCs w:val="0"/>
+          <w:color w:val="auto"/>
+          <w:sz w:val="24"/>
+          <w:szCs w:val="24"/>
+        </w:rPr>
+        <w:t>than</w:t>
+      </w:r>
+      <w:proofErr w:type="spellEnd"/>
+      <w:r>
+        <w:rPr>
+          <w:b w:val="0"/>
+          <w:bCs w:val="0"/>
+          <w:color w:val="auto"/>
+          <w:sz w:val="24"/>
+          <w:szCs w:val="24"/>
+        </w:rPr>
+        <w:t xml:space="preserve"> 50 </w:t>
+      </w:r>
+      <w:proofErr w:type="spellStart"/>
+      <w:r>
+        <w:rPr>
+          <w:b w:val="0"/>
+          <w:bCs w:val="0"/>
+          <w:color w:val="auto"/>
+          <w:sz w:val="24"/>
+          <w:szCs w:val="24"/>
+        </w:rPr>
+        <w:t>points</w:t>
+      </w:r>
+      <w:proofErr w:type="spellEnd"/>
+      <w:r>
+        <w:rPr>
+          <w:b w:val="0"/>
+          <w:bCs w:val="0"/>
+          <w:color w:val="auto"/>
+          <w:sz w:val="24"/>
+          <w:szCs w:val="24"/>
+        </w:rPr>
+        <w:t xml:space="preserve">, </w:t>
+      </w:r>
+      <w:proofErr w:type="spellStart"/>
+      <w:r>
+        <w:rPr>
+          <w:b w:val="0"/>
+          <w:bCs w:val="0"/>
+          <w:color w:val="auto"/>
+          <w:sz w:val="24"/>
+          <w:szCs w:val="24"/>
+        </w:rPr>
+        <w:t>because</w:t>
+      </w:r>
+      <w:proofErr w:type="spellEnd"/>
+      <w:r>
+        <w:rPr>
+          <w:b w:val="0"/>
+          <w:bCs w:val="0"/>
+          <w:color w:val="auto"/>
+          <w:sz w:val="24"/>
+          <w:szCs w:val="24"/>
+        </w:rPr>
+        <w:t xml:space="preserve"> </w:t>
+      </w:r>
+      <w:proofErr w:type="spellStart"/>
+      <w:r>
+        <w:rPr>
+          <w:b w:val="0"/>
+          <w:bCs w:val="0"/>
+          <w:color w:val="auto"/>
+          <w:sz w:val="24"/>
+          <w:szCs w:val="24"/>
+        </w:rPr>
+        <w:t>the</w:t>
+      </w:r>
+      <w:proofErr w:type="spellEnd"/>
+      <w:r>
+        <w:rPr>
+          <w:b w:val="0"/>
+          <w:bCs w:val="0"/>
+          <w:color w:val="auto"/>
+          <w:sz w:val="24"/>
+          <w:szCs w:val="24"/>
+        </w:rPr>
+        <w:t xml:space="preserve"> </w:t>
+      </w:r>
+      <w:proofErr w:type="spellStart"/>
+      <w:r>
+        <w:rPr>
+          <w:b w:val="0"/>
+          <w:bCs w:val="0"/>
+          <w:color w:val="auto"/>
+          <w:sz w:val="24"/>
+          <w:szCs w:val="24"/>
+        </w:rPr>
+        <w:t>weight</w:t>
+      </w:r>
+      <w:proofErr w:type="spellEnd"/>
+      <w:r>
+        <w:rPr>
+          <w:b w:val="0"/>
+          <w:bCs w:val="0"/>
+          <w:color w:val="auto"/>
+          <w:sz w:val="24"/>
+          <w:szCs w:val="24"/>
+        </w:rPr>
+        <w:t xml:space="preserve"> </w:t>
+      </w:r>
+      <w:proofErr w:type="spellStart"/>
+      <w:r>
+        <w:rPr>
+          <w:b w:val="0"/>
+          <w:bCs w:val="0"/>
+          <w:color w:val="auto"/>
+          <w:sz w:val="24"/>
+          <w:szCs w:val="24"/>
+        </w:rPr>
+        <w:t>function</w:t>
+      </w:r>
+      <w:proofErr w:type="spellEnd"/>
+      <w:r>
+        <w:rPr>
+          <w:b w:val="0"/>
+          <w:bCs w:val="0"/>
+          <w:color w:val="auto"/>
+          <w:sz w:val="24"/>
+          <w:szCs w:val="24"/>
+        </w:rPr>
+        <w:t xml:space="preserve"> </w:t>
+      </w:r>
+      <w:proofErr w:type="spellStart"/>
+      <w:r>
+        <w:rPr>
+          <w:b w:val="0"/>
+          <w:bCs w:val="0"/>
+          <w:color w:val="auto"/>
+          <w:sz w:val="24"/>
+          <w:szCs w:val="24"/>
+        </w:rPr>
+        <w:t>is</w:t>
+      </w:r>
+      <w:proofErr w:type="spellEnd"/>
+      <w:r>
+        <w:rPr>
+          <w:b w:val="0"/>
+          <w:bCs w:val="0"/>
+          <w:color w:val="auto"/>
+          <w:sz w:val="24"/>
+          <w:szCs w:val="24"/>
+        </w:rPr>
+        <w:t xml:space="preserve"> non-</w:t>
+      </w:r>
+      <w:proofErr w:type="spellStart"/>
+      <w:r>
+        <w:rPr>
+          <w:b w:val="0"/>
+          <w:bCs w:val="0"/>
+          <w:color w:val="auto"/>
+          <w:sz w:val="24"/>
+          <w:szCs w:val="24"/>
+        </w:rPr>
+        <w:t>linear</w:t>
+      </w:r>
+      <w:proofErr w:type="spellEnd"/>
+      <w:r>
+        <w:rPr>
+          <w:b w:val="0"/>
+          <w:bCs w:val="0"/>
+          <w:color w:val="auto"/>
+          <w:sz w:val="24"/>
+          <w:szCs w:val="24"/>
+        </w:rPr>
+        <w:t>.</w:t>
+      </w:r>
+    </w:p>
+    <w:p>
+      <w:pPr>
+        <w:pStyle w:val="Nadpis2"/>
+        <w:rPr>
+          <w:lang w:val="en-GB"/>
+        </w:rPr>
+      </w:pPr>
+      <w:r>
+        <w:rPr>
+          <w:lang w:val="en-GB"/>
+        </w:rPr>
         <w:t>4. Handler’s ability to read their dog — checkpoints</w:t>
       </w:r>
     </w:p>
@@ -1324,7 +3403,21 @@
         <w:rPr>
           <w:lang w:val="en-GB"/>
         </w:rPr>
-        <w:t>how close to the trail layer’s route the team was at the moment of calling (same weight function as in criterion 3).</w:t>
+        <w:t xml:space="preserve">how close to the trail layer’s route the team was </w:t>
+      </w:r>
+      <w:proofErr w:type="gramStart"/>
+      <w:r>
+        <w:rPr>
+          <w:lang w:val="en-GB"/>
+        </w:rPr>
+        <w:t>at the moment</w:t>
+      </w:r>
+      <w:proofErr w:type="gramEnd"/>
+      <w:r>
+        <w:rPr>
+          <w:lang w:val="en-GB"/>
+        </w:rPr>
+        <w:t xml:space="preserve"> of calling (same weight function as in criterion 3).</w:t>
       </w:r>
     </w:p>
     <w:p>
@@ -1412,6 +3505,22 @@
     </w:p>
     <w:p>
       <w:pPr>
+        <w:spacing w:after="160"/>
+        <w:rPr>
+          <w:lang w:val="en-GB"/>
+        </w:rPr>
+      </w:pPr>
+    </w:p>
+    <w:p>
+      <w:pPr>
+        <w:spacing w:after="160"/>
+        <w:rPr>
+          <w:lang w:val="en-GB"/>
+        </w:rPr>
+      </w:pPr>
+    </w:p>
+    <w:p>
+      <w:pPr>
         <w:pStyle w:val="Nadpis3"/>
         <w:rPr>
           <w:lang w:val="en-GB"/>
@@ -1421,6 +3530,7 @@
         <w:rPr>
           <w:lang w:val="en-GB"/>
         </w:rPr>
+        <w:lastRenderedPageBreak/>
         <w:t>Time as a life-saving factor</w:t>
       </w:r>
     </w:p>
@@ -1435,7 +3545,35 @@
         <w:rPr>
           <w:lang w:val="en-GB"/>
         </w:rPr>
-        <w:t>Luboš Satora states the fundamental principle of mantrailing in the context of real deployments unequivocally:</w:t>
+        <w:t xml:space="preserve">Luboš </w:t>
+      </w:r>
+      <w:proofErr w:type="spellStart"/>
+      <w:r>
+        <w:rPr>
+          <w:lang w:val="en-GB"/>
+        </w:rPr>
+        <w:t>Satora</w:t>
+      </w:r>
+      <w:proofErr w:type="spellEnd"/>
+      <w:r>
+        <w:rPr>
+          <w:lang w:val="en-GB"/>
+        </w:rPr>
+        <w:t xml:space="preserve"> states the fundamental principle of </w:t>
+      </w:r>
+      <w:proofErr w:type="spellStart"/>
+      <w:r>
+        <w:rPr>
+          <w:lang w:val="en-GB"/>
+        </w:rPr>
+        <w:t>mantrailing</w:t>
+      </w:r>
+      <w:proofErr w:type="spellEnd"/>
+      <w:r>
+        <w:rPr>
+          <w:lang w:val="en-GB"/>
+        </w:rPr>
+        <w:t xml:space="preserve"> in the context of real deployments unequivocally:</w:t>
       </w:r>
     </w:p>
     <w:p>
@@ -1452,7 +3590,6 @@
           <w:iCs/>
           <w:lang w:val="en-GB"/>
         </w:rPr>
-        <w:lastRenderedPageBreak/>
         <w:t>“After all, what everyone hopes for in the end is just one thing: finding the (living) missing person as quickly as possible.”</w:t>
       </w:r>
     </w:p>
@@ -1473,7 +3610,79 @@
           <w:szCs w:val="22"/>
           <w:lang w:val="en-GB"/>
         </w:rPr>
-        <w:t>(Satora, Základy mantrailingu)</w:t>
+        <w:t>(</w:t>
+      </w:r>
+      <w:proofErr w:type="spellStart"/>
+      <w:r>
+        <w:rPr>
+          <w:i/>
+          <w:iCs/>
+          <w:color w:val="595959"/>
+          <w:sz w:val="22"/>
+          <w:szCs w:val="22"/>
+          <w:lang w:val="en-GB"/>
+        </w:rPr>
+        <w:t>Satora</w:t>
+      </w:r>
+      <w:proofErr w:type="spellEnd"/>
+      <w:r>
+        <w:rPr>
+          <w:i/>
+          <w:iCs/>
+          <w:color w:val="595959"/>
+          <w:sz w:val="22"/>
+          <w:szCs w:val="22"/>
+          <w:lang w:val="en-GB"/>
+        </w:rPr>
+        <w:t xml:space="preserve">, </w:t>
+      </w:r>
+      <w:proofErr w:type="spellStart"/>
+      <w:r>
+        <w:rPr>
+          <w:i/>
+          <w:iCs/>
+          <w:color w:val="595959"/>
+          <w:sz w:val="22"/>
+          <w:szCs w:val="22"/>
+          <w:lang w:val="en-GB"/>
+        </w:rPr>
+        <w:t>Základy</w:t>
+      </w:r>
+      <w:proofErr w:type="spellEnd"/>
+      <w:r>
+        <w:rPr>
+          <w:i/>
+          <w:iCs/>
+          <w:color w:val="595959"/>
+          <w:sz w:val="22"/>
+          <w:szCs w:val="22"/>
+          <w:lang w:val="en-GB"/>
+        </w:rPr>
+        <w:t xml:space="preserve"> </w:t>
+      </w:r>
+      <w:proofErr w:type="spellStart"/>
+      <w:r>
+        <w:rPr>
+          <w:i/>
+          <w:iCs/>
+          <w:color w:val="595959"/>
+          <w:sz w:val="22"/>
+          <w:szCs w:val="22"/>
+          <w:lang w:val="en-GB"/>
+        </w:rPr>
+        <w:t>mantrailingu</w:t>
+      </w:r>
+      <w:proofErr w:type="spellEnd"/>
+      <w:r>
+        <w:rPr>
+          <w:i/>
+          <w:iCs/>
+          <w:color w:val="595959"/>
+          <w:sz w:val="22"/>
+          <w:szCs w:val="22"/>
+          <w:lang w:val="en-GB"/>
+        </w:rPr>
+        <w:t>)</w:t>
       </w:r>
     </w:p>
     <w:p>
@@ -1483,17 +3692,19 @@
           <w:lang w:val="en-GB"/>
         </w:rPr>
       </w:pPr>
-      <w:r>
-        <w:rPr>
-          <w:lang w:val="en-GB"/>
-        </w:rPr>
-        <w:t>Satora supplements this by adding a practical deployment rule: “In a deployment, the rule always applies: ‘The sooner, the better.’” Speed of finding is not a sporting ambition — it is</w:t>
-      </w:r>
-      <w:r>
-        <w:rPr>
-          <w:lang w:val="en-GB"/>
-        </w:rPr>
-        <w:t xml:space="preserve"> a direct consequence of how efficiently the team works on the trail.</w:t>
+      <w:proofErr w:type="spellStart"/>
+      <w:r>
+        <w:rPr>
+          <w:lang w:val="en-GB"/>
+        </w:rPr>
+        <w:t>Satora</w:t>
+      </w:r>
+      <w:proofErr w:type="spellEnd"/>
+      <w:r>
+        <w:rPr>
+          <w:lang w:val="en-GB"/>
+        </w:rPr>
+        <w:t xml:space="preserve"> supplements this by adding a practical deployment rule: “In a deployment, the rule always applies: ‘The sooner, the better.’” Speed of finding is not a sporting ambition — it is a direct consequence of how efficiently the team works on the trail.</w:t>
       </w:r>
     </w:p>
     <w:p>
@@ -1544,7 +3755,55 @@
           <w:szCs w:val="22"/>
           <w:lang w:val="en-GB"/>
         </w:rPr>
-        <w:t>(Granicz, Mantrailing Fine Tuned)</w:t>
+        <w:t>(</w:t>
+      </w:r>
+      <w:proofErr w:type="spellStart"/>
+      <w:r>
+        <w:rPr>
+          <w:i/>
+          <w:iCs/>
+          <w:color w:val="595959"/>
+          <w:sz w:val="22"/>
+          <w:szCs w:val="22"/>
+          <w:lang w:val="en-GB"/>
+        </w:rPr>
+        <w:t>Granicz</w:t>
+      </w:r>
+      <w:proofErr w:type="spellEnd"/>
+      <w:r>
+        <w:rPr>
+          <w:i/>
+          <w:iCs/>
+          <w:color w:val="595959"/>
+          <w:sz w:val="22"/>
+          <w:szCs w:val="22"/>
+          <w:lang w:val="en-GB"/>
+        </w:rPr>
+        <w:t xml:space="preserve">, </w:t>
+      </w:r>
+      <w:proofErr w:type="spellStart"/>
+      <w:r>
+        <w:rPr>
+          <w:i/>
+          <w:iCs/>
+          <w:color w:val="595959"/>
+          <w:sz w:val="22"/>
+          <w:szCs w:val="22"/>
+          <w:lang w:val="en-GB"/>
+        </w:rPr>
+        <w:t>Mantrailing</w:t>
+      </w:r>
+      <w:proofErr w:type="spellEnd"/>
+      <w:r>
+        <w:rPr>
+          <w:i/>
+          <w:iCs/>
+          <w:color w:val="595959"/>
+          <w:sz w:val="22"/>
+          <w:szCs w:val="22"/>
+          <w:lang w:val="en-GB"/>
+        </w:rPr>
+        <w:t xml:space="preserve"> Fine Tuned)</w:t>
       </w:r>
     </w:p>
     <w:p>
@@ -1554,11 +3813,19 @@
           <w:lang w:val="en-GB"/>
         </w:rPr>
       </w:pPr>
-      <w:r>
-        <w:rPr>
-          <w:lang w:val="en-GB"/>
-        </w:rPr>
-        <w:t>Satora further confirms the urgency in his description of the emergency response system:</w:t>
+      <w:proofErr w:type="spellStart"/>
+      <w:r>
+        <w:rPr>
+          <w:lang w:val="en-GB"/>
+        </w:rPr>
+        <w:t>Satora</w:t>
+      </w:r>
+      <w:proofErr w:type="spellEnd"/>
+      <w:r>
+        <w:rPr>
+          <w:lang w:val="en-GB"/>
+        </w:rPr>
+        <w:t xml:space="preserve"> further confirms the urgency in his description of the emergency response system:</w:t>
       </w:r>
     </w:p>
     <w:p>
@@ -1595,7 +3862,79 @@
           <w:szCs w:val="22"/>
           <w:lang w:val="en-GB"/>
         </w:rPr>
-        <w:t>(Satora, Základy mantrailingu)</w:t>
+        <w:t>(</w:t>
+      </w:r>
+      <w:proofErr w:type="spellStart"/>
+      <w:r>
+        <w:rPr>
+          <w:i/>
+          <w:iCs/>
+          <w:color w:val="595959"/>
+          <w:sz w:val="22"/>
+          <w:szCs w:val="22"/>
+          <w:lang w:val="en-GB"/>
+        </w:rPr>
+        <w:t>Satora</w:t>
+      </w:r>
+      <w:proofErr w:type="spellEnd"/>
+      <w:r>
+        <w:rPr>
+          <w:i/>
+          <w:iCs/>
+          <w:color w:val="595959"/>
+          <w:sz w:val="22"/>
+          <w:szCs w:val="22"/>
+          <w:lang w:val="en-GB"/>
+        </w:rPr>
+        <w:t xml:space="preserve">, </w:t>
+      </w:r>
+      <w:proofErr w:type="spellStart"/>
+      <w:r>
+        <w:rPr>
+          <w:i/>
+          <w:iCs/>
+          <w:color w:val="595959"/>
+          <w:sz w:val="22"/>
+          <w:szCs w:val="22"/>
+          <w:lang w:val="en-GB"/>
+        </w:rPr>
+        <w:t>Základy</w:t>
+      </w:r>
+      <w:proofErr w:type="spellEnd"/>
+      <w:r>
+        <w:rPr>
+          <w:i/>
+          <w:iCs/>
+          <w:color w:val="595959"/>
+          <w:sz w:val="22"/>
+          <w:szCs w:val="22"/>
+          <w:lang w:val="en-GB"/>
+        </w:rPr>
+        <w:t xml:space="preserve"> </w:t>
+      </w:r>
+      <w:proofErr w:type="spellStart"/>
+      <w:r>
+        <w:rPr>
+          <w:i/>
+          <w:iCs/>
+          <w:color w:val="595959"/>
+          <w:sz w:val="22"/>
+          <w:szCs w:val="22"/>
+          <w:lang w:val="en-GB"/>
+        </w:rPr>
+        <w:t>mantrailingu</w:t>
+      </w:r>
+      <w:proofErr w:type="spellEnd"/>
+      <w:r>
+        <w:rPr>
+          <w:i/>
+          <w:iCs/>
+          <w:color w:val="595959"/>
+          <w:sz w:val="22"/>
+          <w:szCs w:val="22"/>
+          <w:lang w:val="en-GB"/>
+        </w:rPr>
+        <w:t>)</w:t>
       </w:r>
     </w:p>
     <w:p>
@@ -1609,7 +3948,35 @@
         <w:rPr>
           <w:lang w:val="en-GB"/>
         </w:rPr>
-        <w:t>While this refers to delay in calling the team rather than the team’s own working pace, the logic is the same: every minute matters. In cases involving medication overdose, hypothermia, or suicidal intent — all situations documented by Satora and Granicz — time is literally life-or-death.</w:t>
+        <w:t xml:space="preserve">While this refers to delay in calling the team rather than the team’s own working pace, the logic is the same: every minute matters. In cases involving medication overdose, hypothermia, or suicidal intent — all situations documented by </w:t>
+      </w:r>
+      <w:proofErr w:type="spellStart"/>
+      <w:r>
+        <w:rPr>
+          <w:lang w:val="en-GB"/>
+        </w:rPr>
+        <w:t>Satora</w:t>
+      </w:r>
+      <w:proofErr w:type="spellEnd"/>
+      <w:r>
+        <w:rPr>
+          <w:lang w:val="en-GB"/>
+        </w:rPr>
+        <w:t xml:space="preserve"> and </w:t>
+      </w:r>
+      <w:proofErr w:type="spellStart"/>
+      <w:r>
+        <w:rPr>
+          <w:lang w:val="en-GB"/>
+        </w:rPr>
+        <w:t>Granicz</w:t>
+      </w:r>
+      <w:proofErr w:type="spellEnd"/>
+      <w:r>
+        <w:rPr>
+          <w:lang w:val="en-GB"/>
+        </w:rPr>
+        <w:t xml:space="preserve"> — time is literally life-or-death.</w:t>
       </w:r>
     </w:p>
     <w:p>
@@ -1623,7 +3990,21 @@
         <w:rPr>
           <w:lang w:val="en-GB"/>
         </w:rPr>
-        <w:t>Direct response to Satora’s criticism</w:t>
+        <w:t xml:space="preserve">Direct response to </w:t>
+      </w:r>
+      <w:proofErr w:type="spellStart"/>
+      <w:r>
+        <w:rPr>
+          <w:lang w:val="en-GB"/>
+        </w:rPr>
+        <w:t>Satora’s</w:t>
+      </w:r>
+      <w:proofErr w:type="spellEnd"/>
+      <w:r>
+        <w:rPr>
+          <w:lang w:val="en-GB"/>
+        </w:rPr>
+        <w:t xml:space="preserve"> criticism</w:t>
       </w:r>
     </w:p>
     <w:p>
@@ -1633,11 +4014,33 @@
           <w:lang w:val="en-GB"/>
         </w:rPr>
       </w:pPr>
-      <w:r>
-        <w:rPr>
-          <w:lang w:val="en-GB"/>
-        </w:rPr>
-        <w:t>Satora writes explicitly: “Mantrailing is not a sport, there is no need to compare ourselves with each other. The criterion is just one — finding the missing person as quickly as possible, without any additional conditions.” This objection is legitimate. If we dismiss it, the rest of the rules lose their footing. It must be addressed directly.</w:t>
+      <w:proofErr w:type="spellStart"/>
+      <w:r>
+        <w:rPr>
+          <w:lang w:val="en-GB"/>
+        </w:rPr>
+        <w:t>Satora</w:t>
+      </w:r>
+      <w:proofErr w:type="spellEnd"/>
+      <w:r>
+        <w:rPr>
+          <w:lang w:val="en-GB"/>
+        </w:rPr>
+        <w:t xml:space="preserve"> writes explicitly: “</w:t>
+      </w:r>
+      <w:proofErr w:type="spellStart"/>
+      <w:r>
+        <w:rPr>
+          <w:lang w:val="en-GB"/>
+        </w:rPr>
+        <w:t>Mantrailing</w:t>
+      </w:r>
+      <w:proofErr w:type="spellEnd"/>
+      <w:r>
+        <w:rPr>
+          <w:lang w:val="en-GB"/>
+        </w:rPr>
+        <w:t xml:space="preserve"> is not a sport, there is no need to compare ourselves with each other. The criterion is just one — finding the missing person as quickly as possible, without any additional conditions.” This objection is legitimate. If we dismiss it, the rest of the rules lose their footing. It must be addressed directly.</w:t>
       </w:r>
     </w:p>
     <w:p>
@@ -1647,17 +4050,47 @@
           <w:lang w:val="en-GB"/>
         </w:rPr>
       </w:pPr>
-      <w:r>
-        <w:rPr>
-          <w:lang w:val="en-GB"/>
-        </w:rPr>
-        <w:t>Satora’s criticism targets competitions where speed is the sole or dominant criterion — where the team that arrived first wins, regardless of how the dog worked. In such a format, Satora is absolutely right: we are rewarding sprinting, not trailing. These rules, however, do not measure speed as a sporting performance. Speed here is conditional on the dog’s work: it is calculated exclusively from the length of trail the team covered with acknowledged checkpoints. A team without acknowledged checkpoints — a t</w:t>
-      </w:r>
-      <w:r>
-        <w:rPr>
-          <w:lang w:val="en-GB"/>
-        </w:rPr>
-        <w:t>eam where the handler cannot demonstrate that the dog was working throughout — gains nothing for speed. Speed here is the result of quality work, not its substitute.</w:t>
+      <w:proofErr w:type="spellStart"/>
+      <w:r>
+        <w:rPr>
+          <w:lang w:val="en-GB"/>
+        </w:rPr>
+        <w:t>Satora’s</w:t>
+      </w:r>
+      <w:proofErr w:type="spellEnd"/>
+      <w:r>
+        <w:rPr>
+          <w:lang w:val="en-GB"/>
+        </w:rPr>
+        <w:t xml:space="preserve"> criticism targets competitions where speed is the sole or dominant criterion — where the team that arrived first wins, regardless of how the dog worked. In such a format, </w:t>
+      </w:r>
+      <w:proofErr w:type="spellStart"/>
+      <w:r>
+        <w:rPr>
+          <w:lang w:val="en-GB"/>
+        </w:rPr>
+        <w:t>Satora</w:t>
+      </w:r>
+      <w:proofErr w:type="spellEnd"/>
+      <w:r>
+        <w:rPr>
+          <w:lang w:val="en-GB"/>
+        </w:rPr>
+        <w:t xml:space="preserve"> is </w:t>
+      </w:r>
+      <w:proofErr w:type="gramStart"/>
+      <w:r>
+        <w:rPr>
+          <w:lang w:val="en-GB"/>
+        </w:rPr>
+        <w:t>absolutely right</w:t>
+      </w:r>
+      <w:proofErr w:type="gramEnd"/>
+      <w:r>
+        <w:rPr>
+          <w:lang w:val="en-GB"/>
+        </w:rPr>
+        <w:t>: we are rewarding sprinting, not trailing. These rules, however, do not measure speed as a sporting performance. Speed here is conditional on the dog’s work: it is calculated exclusively from the length of trail the team covered with acknowledged checkpoints. A team without acknowledged checkpoints — a team where the handler cannot demonstrate that the dog was working throughout — gains nothing for speed. Speed here is the result of quality work, not its substitute.</w:t>
       </w:r>
     </w:p>
     <w:p>
@@ -1726,13 +4159,35 @@
         <w:rPr>
           <w:lang w:val="en-GB"/>
         </w:rPr>
-        <w:t>the core principle of mantrailing as stated by Satora: the goal is to find the living missing</w:t>
-      </w:r>
-      <w:r>
-        <w:rPr>
-          <w:lang w:val="en-GB"/>
-        </w:rPr>
-        <w:t xml:space="preserve"> person as quickly as possible. Scoring efficiency motivates teams to work effectively — in a real deployment, every saved minute can mean the difference between life and death.</w:t>
+        <w:t xml:space="preserve">the core principle of </w:t>
+      </w:r>
+      <w:proofErr w:type="spellStart"/>
+      <w:r>
+        <w:rPr>
+          <w:lang w:val="en-GB"/>
+        </w:rPr>
+        <w:t>mantrailing</w:t>
+      </w:r>
+      <w:proofErr w:type="spellEnd"/>
+      <w:r>
+        <w:rPr>
+          <w:lang w:val="en-GB"/>
+        </w:rPr>
+        <w:t xml:space="preserve"> as stated by </w:t>
+      </w:r>
+      <w:proofErr w:type="spellStart"/>
+      <w:r>
+        <w:rPr>
+          <w:lang w:val="en-GB"/>
+        </w:rPr>
+        <w:t>Satora</w:t>
+      </w:r>
+      <w:proofErr w:type="spellEnd"/>
+      <w:r>
+        <w:rPr>
+          <w:lang w:val="en-GB"/>
+        </w:rPr>
+        <w:t>: the goal is to find the living missing person as quickly as possible. Scoring efficiency motivates teams to work effectively — in a real deployment, every saved minute can mean the difference between life and death.</w:t>
       </w:r>
     </w:p>
     <w:p>
@@ -1753,6 +4208,7 @@
           <w:bCs/>
           <w:lang w:val="en-GB"/>
         </w:rPr>
+        <w:lastRenderedPageBreak/>
         <w:t xml:space="preserve">Measures </w:t>
       </w:r>
       <w:r>
@@ -1780,7 +4236,6 @@
           <w:bCs/>
           <w:lang w:val="en-GB"/>
         </w:rPr>
-        <w:lastRenderedPageBreak/>
         <w:t xml:space="preserve">Does not disproportionately reward </w:t>
       </w:r>
       <w:r>
@@ -1822,7 +4277,21 @@
         <w:rPr>
           <w:lang w:val="en-GB"/>
         </w:rPr>
-        <w:t>Evaluating trailing accuracy is one of the most sensitive points of the rules, as opinions in the mantrailing community differ on whether accuracy is a measurable and relevant indicator at all. This section summarises the expert arguments underpinning the criterion.</w:t>
+        <w:t xml:space="preserve">Evaluating trailing accuracy is one of the most sensitive points of the rules, as opinions in the </w:t>
+      </w:r>
+      <w:proofErr w:type="spellStart"/>
+      <w:r>
+        <w:rPr>
+          <w:lang w:val="en-GB"/>
+        </w:rPr>
+        <w:t>mantrailing</w:t>
+      </w:r>
+      <w:proofErr w:type="spellEnd"/>
+      <w:r>
+        <w:rPr>
+          <w:lang w:val="en-GB"/>
+        </w:rPr>
+        <w:t xml:space="preserve"> community differ on whether accuracy is a measurable and relevant indicator at all. This section summarises the expert arguments underpinning the criterion.</w:t>
       </w:r>
     </w:p>
     <w:p>
@@ -1832,11 +4301,19 @@
           <w:lang w:val="en-GB"/>
         </w:rPr>
       </w:pPr>
-      <w:r>
-        <w:rPr>
-          <w:lang w:val="en-GB"/>
-        </w:rPr>
-        <w:t>Mantrailing accuracy is not the same as sport-tracking accuracy</w:t>
+      <w:proofErr w:type="spellStart"/>
+      <w:r>
+        <w:rPr>
+          <w:lang w:val="en-GB"/>
+        </w:rPr>
+        <w:t>Mantrailing</w:t>
+      </w:r>
+      <w:proofErr w:type="spellEnd"/>
+      <w:r>
+        <w:rPr>
+          <w:lang w:val="en-GB"/>
+        </w:rPr>
+        <w:t xml:space="preserve"> accuracy is not the same as sport-tracking accuracy</w:t>
       </w:r>
     </w:p>
     <w:p>
@@ -1850,7 +4327,35 @@
         <w:rPr>
           <w:lang w:val="en-GB"/>
         </w:rPr>
-        <w:t>The most common objection to evaluating accuracy is: “a mantrailing dog simply does not work precisely along the trail layer’s route.” This objection is correct — but it targets a different kind of evaluation than these rules use. Luboš Satora explains the physics of scent particles:</w:t>
+        <w:t xml:space="preserve">The most common objection to evaluating accuracy is: “a </w:t>
+      </w:r>
+      <w:proofErr w:type="spellStart"/>
+      <w:r>
+        <w:rPr>
+          <w:lang w:val="en-GB"/>
+        </w:rPr>
+        <w:t>mantrailing</w:t>
+      </w:r>
+      <w:proofErr w:type="spellEnd"/>
+      <w:r>
+        <w:rPr>
+          <w:lang w:val="en-GB"/>
+        </w:rPr>
+        <w:t xml:space="preserve"> dog simply does not work precisely along the trail layer’s route.” This objection is correct — but it targets a different kind of evaluation than these rules use. Luboš </w:t>
+      </w:r>
+      <w:proofErr w:type="spellStart"/>
+      <w:r>
+        <w:rPr>
+          <w:lang w:val="en-GB"/>
+        </w:rPr>
+        <w:t>Satora</w:t>
+      </w:r>
+      <w:proofErr w:type="spellEnd"/>
+      <w:r>
+        <w:rPr>
+          <w:lang w:val="en-GB"/>
+        </w:rPr>
+        <w:t xml:space="preserve"> explains the physics of scent particles:</w:t>
       </w:r>
     </w:p>
     <w:p>
@@ -1887,7 +4392,79 @@
           <w:szCs w:val="22"/>
           <w:lang w:val="en-GB"/>
         </w:rPr>
-        <w:t>(Satora, Základy mantrailingu)</w:t>
+        <w:t>(</w:t>
+      </w:r>
+      <w:proofErr w:type="spellStart"/>
+      <w:r>
+        <w:rPr>
+          <w:i/>
+          <w:iCs/>
+          <w:color w:val="595959"/>
+          <w:sz w:val="22"/>
+          <w:szCs w:val="22"/>
+          <w:lang w:val="en-GB"/>
+        </w:rPr>
+        <w:t>Satora</w:t>
+      </w:r>
+      <w:proofErr w:type="spellEnd"/>
+      <w:r>
+        <w:rPr>
+          <w:i/>
+          <w:iCs/>
+          <w:color w:val="595959"/>
+          <w:sz w:val="22"/>
+          <w:szCs w:val="22"/>
+          <w:lang w:val="en-GB"/>
+        </w:rPr>
+        <w:t xml:space="preserve">, </w:t>
+      </w:r>
+      <w:proofErr w:type="spellStart"/>
+      <w:r>
+        <w:rPr>
+          <w:i/>
+          <w:iCs/>
+          <w:color w:val="595959"/>
+          <w:sz w:val="22"/>
+          <w:szCs w:val="22"/>
+          <w:lang w:val="en-GB"/>
+        </w:rPr>
+        <w:t>Základy</w:t>
+      </w:r>
+      <w:proofErr w:type="spellEnd"/>
+      <w:r>
+        <w:rPr>
+          <w:i/>
+          <w:iCs/>
+          <w:color w:val="595959"/>
+          <w:sz w:val="22"/>
+          <w:szCs w:val="22"/>
+          <w:lang w:val="en-GB"/>
+        </w:rPr>
+        <w:t xml:space="preserve"> </w:t>
+      </w:r>
+      <w:proofErr w:type="spellStart"/>
+      <w:r>
+        <w:rPr>
+          <w:i/>
+          <w:iCs/>
+          <w:color w:val="595959"/>
+          <w:sz w:val="22"/>
+          <w:szCs w:val="22"/>
+          <w:lang w:val="en-GB"/>
+        </w:rPr>
+        <w:t>mantrailingu</w:t>
+      </w:r>
+      <w:proofErr w:type="spellEnd"/>
+      <w:r>
+        <w:rPr>
+          <w:i/>
+          <w:iCs/>
+          <w:color w:val="595959"/>
+          <w:sz w:val="22"/>
+          <w:szCs w:val="22"/>
+          <w:lang w:val="en-GB"/>
+        </w:rPr>
+        <w:t>)</w:t>
       </w:r>
     </w:p>
     <w:p>
@@ -1903,11 +4480,33 @@
         </w:rPr>
         <w:t xml:space="preserve">Csaba Granicz states this distinction even more explicitly and defines what accuracy in </w:t>
       </w:r>
-      <w:r>
-        <w:rPr>
-          <w:lang w:val="en-GB"/>
-        </w:rPr>
-        <w:t>mantrailing actually means:</w:t>
+      <w:proofErr w:type="spellStart"/>
+      <w:r>
+        <w:rPr>
+          <w:lang w:val="en-GB"/>
+        </w:rPr>
+        <w:t>mantrailing</w:t>
+      </w:r>
+      <w:proofErr w:type="spellEnd"/>
+      <w:r>
+        <w:rPr>
+          <w:lang w:val="en-GB"/>
+        </w:rPr>
+        <w:t xml:space="preserve"> </w:t>
+      </w:r>
+      <w:proofErr w:type="gramStart"/>
+      <w:r>
+        <w:rPr>
+          <w:lang w:val="en-GB"/>
+        </w:rPr>
+        <w:t>actually means</w:t>
+      </w:r>
+      <w:proofErr w:type="gramEnd"/>
+      <w:r>
+        <w:rPr>
+          <w:lang w:val="en-GB"/>
+        </w:rPr>
+        <w:t>:</w:t>
       </w:r>
     </w:p>
     <w:p>
@@ -1924,15 +4523,61 @@
           <w:iCs/>
           <w:lang w:val="en-GB"/>
         </w:rPr>
-        <w:t xml:space="preserve">“When training your mantrailing dog, it is important to keep the tracking as accurate as possible — that is, to keep the so-called wavering to a minimum and to keep the dog as close as possible to the scent residues left behind. Here, however, accuracy is not measured in terms of the path the trail layer has physically travelled, but rather by trying to estimate, to the best of our ability, the external factors that influence the spread of odors. So, we do not expect our dog to follow the physical trail to </w:t>
-      </w:r>
-      <w:r>
-        <w:rPr>
-          <w:i/>
-          <w:iCs/>
-          <w:lang w:val="en-GB"/>
-        </w:rPr>
-        <w:t>the nearest centimeter. We must leave him much more room to work the scent. However, this freer style of tracking carries with it the risk that if the dog works way too wide and does not try to get close to the scent residue of the trail, his work will become inaccurate, and he may easily lose the trail.”</w:t>
+        <w:t xml:space="preserve">“When training your </w:t>
+      </w:r>
+      <w:proofErr w:type="spellStart"/>
+      <w:r>
+        <w:rPr>
+          <w:i/>
+          <w:iCs/>
+          <w:lang w:val="en-GB"/>
+        </w:rPr>
+        <w:t>mantrailing</w:t>
+      </w:r>
+      <w:proofErr w:type="spellEnd"/>
+      <w:r>
+        <w:rPr>
+          <w:i/>
+          <w:iCs/>
+          <w:lang w:val="en-GB"/>
+        </w:rPr>
+        <w:t xml:space="preserve"> dog, it is important to keep the tracking as accurate as possible — that is, to keep the so-called wavering to a minimum and to keep the dog as close as possible to the scent residues left behind. Here, however, accuracy is not measured in terms of the path the trail layer has physically travelled, but rather by trying to estimate, to the best of our ability, the external factors that influence the spread of </w:t>
+      </w:r>
+      <w:proofErr w:type="spellStart"/>
+      <w:r>
+        <w:rPr>
+          <w:i/>
+          <w:iCs/>
+          <w:lang w:val="en-GB"/>
+        </w:rPr>
+        <w:t>odors</w:t>
+      </w:r>
+      <w:proofErr w:type="spellEnd"/>
+      <w:r>
+        <w:rPr>
+          <w:i/>
+          <w:iCs/>
+          <w:lang w:val="en-GB"/>
+        </w:rPr>
+        <w:t xml:space="preserve">. So, we do not expect our dog to follow the physical trail to the nearest </w:t>
+      </w:r>
+      <w:proofErr w:type="spellStart"/>
+      <w:r>
+        <w:rPr>
+          <w:i/>
+          <w:iCs/>
+          <w:lang w:val="en-GB"/>
+        </w:rPr>
+        <w:t>centimeter</w:t>
+      </w:r>
+      <w:proofErr w:type="spellEnd"/>
+      <w:r>
+        <w:rPr>
+          <w:i/>
+          <w:iCs/>
+          <w:lang w:val="en-GB"/>
+        </w:rPr>
+        <w:t>. We must leave him much more room to work the scent. However, this freer style of tracking carries with it the risk that if the dog works way too wide and does not try to get close to the scent residue of the trail, his work will become inaccurate, and he may easily lose the trail.”</w:t>
       </w:r>
     </w:p>
     <w:p>
@@ -1952,7 +4597,55 @@
           <w:szCs w:val="22"/>
           <w:lang w:val="en-GB"/>
         </w:rPr>
-        <w:t>(Granicz, Mantrailing Fine Tuned)</w:t>
+        <w:t>(</w:t>
+      </w:r>
+      <w:proofErr w:type="spellStart"/>
+      <w:r>
+        <w:rPr>
+          <w:i/>
+          <w:iCs/>
+          <w:color w:val="595959"/>
+          <w:sz w:val="22"/>
+          <w:szCs w:val="22"/>
+          <w:lang w:val="en-GB"/>
+        </w:rPr>
+        <w:t>Granicz</w:t>
+      </w:r>
+      <w:proofErr w:type="spellEnd"/>
+      <w:r>
+        <w:rPr>
+          <w:i/>
+          <w:iCs/>
+          <w:color w:val="595959"/>
+          <w:sz w:val="22"/>
+          <w:szCs w:val="22"/>
+          <w:lang w:val="en-GB"/>
+        </w:rPr>
+        <w:t xml:space="preserve">, </w:t>
+      </w:r>
+      <w:proofErr w:type="spellStart"/>
+      <w:r>
+        <w:rPr>
+          <w:i/>
+          <w:iCs/>
+          <w:color w:val="595959"/>
+          <w:sz w:val="22"/>
+          <w:szCs w:val="22"/>
+          <w:lang w:val="en-GB"/>
+        </w:rPr>
+        <w:t>Mantrailing</w:t>
+      </w:r>
+      <w:proofErr w:type="spellEnd"/>
+      <w:r>
+        <w:rPr>
+          <w:i/>
+          <w:iCs/>
+          <w:color w:val="595959"/>
+          <w:sz w:val="22"/>
+          <w:szCs w:val="22"/>
+          <w:lang w:val="en-GB"/>
+        </w:rPr>
+        <w:t xml:space="preserve"> Fine Tuned)</w:t>
       </w:r>
     </w:p>
     <w:p>
@@ -1966,7 +4659,21 @@
         <w:rPr>
           <w:lang w:val="en-GB"/>
         </w:rPr>
-        <w:t>Accuracy in mantrailing is therefore not replication of the trail layer’s physical route (that is sport tracking), but the degree to which the dog remains within reach of the scent trail and does not unnecessarily drift into areas where scent is absent. This is why these rules treat deviations under 10 m as “excellent accuracy” and only begin to apply significant weight reduction from 50 m upwards.</w:t>
+        <w:t xml:space="preserve">Accuracy in </w:t>
+      </w:r>
+      <w:proofErr w:type="spellStart"/>
+      <w:r>
+        <w:rPr>
+          <w:lang w:val="en-GB"/>
+        </w:rPr>
+        <w:t>mantrailing</w:t>
+      </w:r>
+      <w:proofErr w:type="spellEnd"/>
+      <w:r>
+        <w:rPr>
+          <w:lang w:val="en-GB"/>
+        </w:rPr>
+        <w:t xml:space="preserve"> is therefore not replication of the trail layer’s physical route (that is sport tracking), but the degree to which the dog remains within reach of the scent trail and does not unnecessarily drift into areas where scent is absent. This is why these rules treat deviations under 10 m as “excellent accuracy” and only begin to apply significant weight reduction from 50 m upwards.</w:t>
       </w:r>
     </w:p>
     <w:p>
@@ -1994,7 +4701,21 @@
         <w:rPr>
           <w:lang w:val="en-GB"/>
         </w:rPr>
-        <w:t>Granicz’s “freer style” is not without risk — and Granicz himself flags this (see quote above). Jeff Schettler documents this principle through a concrete field case: his dog began working too far from the trail — due to a strong scent cone drifting from a building — lost the connection, and the deployment ended in failure:</w:t>
+        <w:t xml:space="preserve">Granicz’s “freer style” is not without risk — and </w:t>
+      </w:r>
+      <w:proofErr w:type="spellStart"/>
+      <w:r>
+        <w:rPr>
+          <w:lang w:val="en-GB"/>
+        </w:rPr>
+        <w:t>Granicz</w:t>
+      </w:r>
+      <w:proofErr w:type="spellEnd"/>
+      <w:r>
+        <w:rPr>
+          <w:lang w:val="en-GB"/>
+        </w:rPr>
+        <w:t xml:space="preserve"> himself flags this (see quote above). Jeff Schettler documents this principle through a concrete field case: his dog began working too far from the trail — due to a strong scent cone drifting from a building — lost the connection, and the deployment ended in failure:</w:t>
       </w:r>
     </w:p>
     <w:p>
@@ -2011,16 +4732,44 @@
           <w:iCs/>
           <w:lang w:val="en-GB"/>
         </w:rPr>
-        <w:t xml:space="preserve">“If the spot drifted far away from the trail, my dog would eventually forget where the trail was in favor of all the fresh odor that led nowhere. […] What happened in the real case I wrote about was we struggled so long and hard, and I corrected my dog so much that </w:t>
-      </w:r>
-      <w:r>
-        <w:rPr>
-          <w:i/>
-          <w:iCs/>
-          <w:lang w:val="en-GB"/>
-        </w:rPr>
         <w:lastRenderedPageBreak/>
-        <w:t>he shut down and the trail did not exist anymore for those reasons alone. I should have been spit on; I was so annoyed with myself!”</w:t>
+        <w:t xml:space="preserve">“If the spot drifted far away from the trail, my dog would eventually forget where the trail was in </w:t>
+      </w:r>
+      <w:proofErr w:type="spellStart"/>
+      <w:r>
+        <w:rPr>
+          <w:i/>
+          <w:iCs/>
+          <w:lang w:val="en-GB"/>
+        </w:rPr>
+        <w:t>favor</w:t>
+      </w:r>
+      <w:proofErr w:type="spellEnd"/>
+      <w:r>
+        <w:rPr>
+          <w:i/>
+          <w:iCs/>
+          <w:lang w:val="en-GB"/>
+        </w:rPr>
+        <w:t xml:space="preserve"> of all the fresh </w:t>
+      </w:r>
+      <w:proofErr w:type="spellStart"/>
+      <w:r>
+        <w:rPr>
+          <w:i/>
+          <w:iCs/>
+          <w:lang w:val="en-GB"/>
+        </w:rPr>
+        <w:t>odor</w:t>
+      </w:r>
+      <w:proofErr w:type="spellEnd"/>
+      <w:r>
+        <w:rPr>
+          <w:i/>
+          <w:iCs/>
+          <w:lang w:val="en-GB"/>
+        </w:rPr>
+        <w:t xml:space="preserve"> that led nowhere. […] What happened in the real case I wrote about was we struggled so long and hard, and I corrected my dog so much that he shut down and the trail did not exist anymore for those reasons alone. I should have been spit on; I was so annoyed with myself!”</w:t>
       </w:r>
     </w:p>
     <w:p>
@@ -2082,7 +4831,21 @@
         <w:rPr>
           <w:lang w:val="en-GB"/>
         </w:rPr>
-        <w:t>A dog working accurately that reaches the point where it can no longer follow the trail provides the rescue service with a key piece of information: where the target scent was last present. This is critical for follow-on teams or other search resources. Granicz notes the importance of accurate GPS records directly in a deployment context:</w:t>
+        <w:t xml:space="preserve">A dog working accurately that reaches the point where it can no longer follow the trail provides the rescue service with a key piece of information: where the target scent was last present. This is critical for follow-on teams or other search resources. </w:t>
+      </w:r>
+      <w:proofErr w:type="spellStart"/>
+      <w:r>
+        <w:rPr>
+          <w:lang w:val="en-GB"/>
+        </w:rPr>
+        <w:t>Granicz</w:t>
+      </w:r>
+      <w:proofErr w:type="spellEnd"/>
+      <w:r>
+        <w:rPr>
+          <w:lang w:val="en-GB"/>
+        </w:rPr>
+        <w:t xml:space="preserve"> notes the importance of accurate GPS records directly in a deployment context:</w:t>
       </w:r>
     </w:p>
     <w:p>
@@ -2099,15 +4862,25 @@
           <w:iCs/>
           <w:lang w:val="en-GB"/>
         </w:rPr>
-        <w:t>“GPS tracking is also a useful aid, giving you instant warning if you plan to lead your dog back to the wrong place. […] On more than one occasion during our training sessions, a dog handler has noticed that his dog is no longer following the trail of the person hiding, so he leads him back to where he thinks they were. But that point was up to ten meters further away from the actual trail. In such cases, the dog may be lucky enough to ‘air scent’ the trail […] but it may not be able to do so and the search</w:t>
-      </w:r>
-      <w:r>
-        <w:rPr>
-          <w:i/>
-          <w:iCs/>
-          <w:lang w:val="en-GB"/>
-        </w:rPr>
-        <w:t xml:space="preserve"> may end in a dead end because the dog handler’s mind map was incorrect.”</w:t>
+        <w:t xml:space="preserve">“GPS tracking is also a useful aid, giving you instant warning if you plan to lead your dog back to the wrong place. […] On more than one occasion during our training sessions, a dog handler has noticed that his dog is no longer following the trail of the person hiding, so he leads him back to where he thinks they were. But that point was up to ten meters further away from the actual trail. In such cases, the dog may be lucky enough to ‘air scent’ the trail […] but it may not be able to do </w:t>
+      </w:r>
+      <w:proofErr w:type="gramStart"/>
+      <w:r>
+        <w:rPr>
+          <w:i/>
+          <w:iCs/>
+          <w:lang w:val="en-GB"/>
+        </w:rPr>
+        <w:t>so</w:t>
+      </w:r>
+      <w:proofErr w:type="gramEnd"/>
+      <w:r>
+        <w:rPr>
+          <w:i/>
+          <w:iCs/>
+          <w:lang w:val="en-GB"/>
+        </w:rPr>
+        <w:t xml:space="preserve"> and the search may end in a dead end because the dog handler’s mind map was incorrect.”</w:t>
       </w:r>
     </w:p>
     <w:p>
@@ -2127,7 +4900,55 @@
           <w:szCs w:val="22"/>
           <w:lang w:val="en-GB"/>
         </w:rPr>
-        <w:t>(Granicz, Mantrailing Fine Tuned)</w:t>
+        <w:t>(</w:t>
+      </w:r>
+      <w:proofErr w:type="spellStart"/>
+      <w:r>
+        <w:rPr>
+          <w:i/>
+          <w:iCs/>
+          <w:color w:val="595959"/>
+          <w:sz w:val="22"/>
+          <w:szCs w:val="22"/>
+          <w:lang w:val="en-GB"/>
+        </w:rPr>
+        <w:t>Granicz</w:t>
+      </w:r>
+      <w:proofErr w:type="spellEnd"/>
+      <w:r>
+        <w:rPr>
+          <w:i/>
+          <w:iCs/>
+          <w:color w:val="595959"/>
+          <w:sz w:val="22"/>
+          <w:szCs w:val="22"/>
+          <w:lang w:val="en-GB"/>
+        </w:rPr>
+        <w:t xml:space="preserve">, </w:t>
+      </w:r>
+      <w:proofErr w:type="spellStart"/>
+      <w:r>
+        <w:rPr>
+          <w:i/>
+          <w:iCs/>
+          <w:color w:val="595959"/>
+          <w:sz w:val="22"/>
+          <w:szCs w:val="22"/>
+          <w:lang w:val="en-GB"/>
+        </w:rPr>
+        <w:t>Mantrailing</w:t>
+      </w:r>
+      <w:proofErr w:type="spellEnd"/>
+      <w:r>
+        <w:rPr>
+          <w:i/>
+          <w:iCs/>
+          <w:color w:val="595959"/>
+          <w:sz w:val="22"/>
+          <w:szCs w:val="22"/>
+          <w:lang w:val="en-GB"/>
+        </w:rPr>
+        <w:t xml:space="preserve"> Fine Tuned)</w:t>
       </w:r>
     </w:p>
     <w:p>
@@ -2195,7 +5016,21 @@
         <w:rPr>
           <w:lang w:val="en-GB"/>
         </w:rPr>
-        <w:t>large deviations (50 m and above), which according to the literature (Granicz, Schettler) signal loss of scent contact and significantly increase the risk of deployment failure.</w:t>
+        <w:t>large deviations (50 m and above), which according to the literature (</w:t>
+      </w:r>
+      <w:proofErr w:type="spellStart"/>
+      <w:r>
+        <w:rPr>
+          <w:lang w:val="en-GB"/>
+        </w:rPr>
+        <w:t>Granicz</w:t>
+      </w:r>
+      <w:proofErr w:type="spellEnd"/>
+      <w:r>
+        <w:rPr>
+          <w:lang w:val="en-GB"/>
+        </w:rPr>
+        <w:t>, Schettler) signal loss of scent contact and significantly increase the risk of deployment failure.</w:t>
       </w:r>
     </w:p>
     <w:p>
@@ -2230,7 +5065,21 @@
         <w:rPr>
           <w:lang w:val="en-GB"/>
         </w:rPr>
-        <w:t>Reading the dog — the handler’s ability to correctly interpret the dog’s behaviour and at every moment distinguish whether the dog is working on the scent trail or not — is unanimously regarded in the literature as the key competency of the entire mantrailing team. Checkpoints in this competition are a measurable tool that objectively captures this competency.</w:t>
+        <w:t xml:space="preserve">Reading the dog — the handler’s ability to correctly interpret the dog’s behaviour and at every moment distinguish whether the dog is working on the scent trail or not — is unanimously regarded in the literature as the key competency of the entire </w:t>
+      </w:r>
+      <w:proofErr w:type="spellStart"/>
+      <w:r>
+        <w:rPr>
+          <w:lang w:val="en-GB"/>
+        </w:rPr>
+        <w:t>mantrailing</w:t>
+      </w:r>
+      <w:proofErr w:type="spellEnd"/>
+      <w:r>
+        <w:rPr>
+          <w:lang w:val="en-GB"/>
+        </w:rPr>
+        <w:t xml:space="preserve"> team. Checkpoints in this competition are a measurable tool that objectively captures this competency.</w:t>
       </w:r>
     </w:p>
     <w:p>
@@ -2258,7 +5107,21 @@
         <w:rPr>
           <w:lang w:val="en-GB"/>
         </w:rPr>
-        <w:t>Luboš Satora defines reading the dog as the handler’s primary task throughout the entire trail:</w:t>
+        <w:t xml:space="preserve">Luboš </w:t>
+      </w:r>
+      <w:proofErr w:type="spellStart"/>
+      <w:r>
+        <w:rPr>
+          <w:lang w:val="en-GB"/>
+        </w:rPr>
+        <w:t>Satora</w:t>
+      </w:r>
+      <w:proofErr w:type="spellEnd"/>
+      <w:r>
+        <w:rPr>
+          <w:lang w:val="en-GB"/>
+        </w:rPr>
+        <w:t xml:space="preserve"> defines reading the dog as the handler’s primary task throughout the entire trail:</w:t>
       </w:r>
     </w:p>
     <w:p>
@@ -2295,7 +5158,79 @@
           <w:szCs w:val="22"/>
           <w:lang w:val="en-GB"/>
         </w:rPr>
-        <w:t>(Satora, Základy mantrailingu)</w:t>
+        <w:t>(</w:t>
+      </w:r>
+      <w:proofErr w:type="spellStart"/>
+      <w:r>
+        <w:rPr>
+          <w:i/>
+          <w:iCs/>
+          <w:color w:val="595959"/>
+          <w:sz w:val="22"/>
+          <w:szCs w:val="22"/>
+          <w:lang w:val="en-GB"/>
+        </w:rPr>
+        <w:t>Satora</w:t>
+      </w:r>
+      <w:proofErr w:type="spellEnd"/>
+      <w:r>
+        <w:rPr>
+          <w:i/>
+          <w:iCs/>
+          <w:color w:val="595959"/>
+          <w:sz w:val="22"/>
+          <w:szCs w:val="22"/>
+          <w:lang w:val="en-GB"/>
+        </w:rPr>
+        <w:t xml:space="preserve">, </w:t>
+      </w:r>
+      <w:proofErr w:type="spellStart"/>
+      <w:r>
+        <w:rPr>
+          <w:i/>
+          <w:iCs/>
+          <w:color w:val="595959"/>
+          <w:sz w:val="22"/>
+          <w:szCs w:val="22"/>
+          <w:lang w:val="en-GB"/>
+        </w:rPr>
+        <w:t>Základy</w:t>
+      </w:r>
+      <w:proofErr w:type="spellEnd"/>
+      <w:r>
+        <w:rPr>
+          <w:i/>
+          <w:iCs/>
+          <w:color w:val="595959"/>
+          <w:sz w:val="22"/>
+          <w:szCs w:val="22"/>
+          <w:lang w:val="en-GB"/>
+        </w:rPr>
+        <w:t xml:space="preserve"> </w:t>
+      </w:r>
+      <w:proofErr w:type="spellStart"/>
+      <w:r>
+        <w:rPr>
+          <w:i/>
+          <w:iCs/>
+          <w:color w:val="595959"/>
+          <w:sz w:val="22"/>
+          <w:szCs w:val="22"/>
+          <w:lang w:val="en-GB"/>
+        </w:rPr>
+        <w:t>mantrailingu</w:t>
+      </w:r>
+      <w:proofErr w:type="spellEnd"/>
+      <w:r>
+        <w:rPr>
+          <w:i/>
+          <w:iCs/>
+          <w:color w:val="595959"/>
+          <w:sz w:val="22"/>
+          <w:szCs w:val="22"/>
+          <w:lang w:val="en-GB"/>
+        </w:rPr>
+        <w:t>)</w:t>
       </w:r>
     </w:p>
     <w:p>
@@ -2305,11 +5240,20 @@
           <w:lang w:val="en-GB"/>
         </w:rPr>
       </w:pPr>
-      <w:r>
-        <w:rPr>
-          <w:lang w:val="en-GB"/>
-        </w:rPr>
-        <w:t>Satora further lists the inability to read the dog as one of the most common handler errors: “They cannot read from the dog’s movements and behaviour what it is doing.” This inability is not merely a personal weakness — it is a systemic barrier to the entire team’s effective performance.</w:t>
+      <w:proofErr w:type="spellStart"/>
+      <w:r>
+        <w:rPr>
+          <w:lang w:val="en-GB"/>
+        </w:rPr>
+        <w:lastRenderedPageBreak/>
+        <w:t>Satora</w:t>
+      </w:r>
+      <w:proofErr w:type="spellEnd"/>
+      <w:r>
+        <w:rPr>
+          <w:lang w:val="en-GB"/>
+        </w:rPr>
+        <w:t xml:space="preserve"> further lists the inability to read the dog as one of the most common handler errors: “They cannot read from the dog’s movements and behaviour what it is doing.” This inability is not merely a personal weakness — it is a systemic barrier to the entire team’s effective performance.</w:t>
       </w:r>
     </w:p>
     <w:p>
@@ -2323,7 +5267,6 @@
         <w:rPr>
           <w:lang w:val="en-GB"/>
         </w:rPr>
-        <w:lastRenderedPageBreak/>
         <w:t>Schettler states this requirement even more radically. He describes how a handler lacking this competency inevitably takes control — and in doing so, damages the dog:</w:t>
       </w:r>
     </w:p>
@@ -2341,15 +5284,43 @@
           <w:iCs/>
           <w:lang w:val="en-GB"/>
         </w:rPr>
-        <w:t xml:space="preserve">“Many handlers make the mistake of allowing a dog that is not actively following scent to get to the area where the subject of their search is hiding — to allow them to make the find. They do this because they cannot read the dog’s body language that screams: ‘NOT FOLLOWING SCENT!’ […] The dog will learn a behaviour that the handler unintentionally teaches it — if the dog learns that when the chips are down the handler will lead it to the subject’s location, it will learn to ‘not work’ each and every time, </w:t>
-      </w:r>
-      <w:r>
-        <w:rPr>
-          <w:i/>
-          <w:iCs/>
-          <w:lang w:val="en-GB"/>
-        </w:rPr>
-        <w:t>and simply run.”</w:t>
+        <w:t xml:space="preserve">“Many handlers make the mistake of allowing a dog that is not actively following scent to get to the area where the subject of their search is hiding — to allow them to make the find. They do this because they cannot read the dog’s body language that screams: ‘NOT FOLLOWING SCENT!’ […] The dog will learn a behaviour that the handler unintentionally teaches it — if the dog learns that when the chips are down the handler will lead it to the subject’s location, it will learn to ‘not work’ </w:t>
+      </w:r>
+      <w:proofErr w:type="gramStart"/>
+      <w:r>
+        <w:rPr>
+          <w:i/>
+          <w:iCs/>
+          <w:lang w:val="en-GB"/>
+        </w:rPr>
+        <w:t>each and every</w:t>
+      </w:r>
+      <w:proofErr w:type="gramEnd"/>
+      <w:r>
+        <w:rPr>
+          <w:i/>
+          <w:iCs/>
+          <w:lang w:val="en-GB"/>
+        </w:rPr>
+        <w:t xml:space="preserve"> </w:t>
+      </w:r>
+      <w:proofErr w:type="gramStart"/>
+      <w:r>
+        <w:rPr>
+          <w:i/>
+          <w:iCs/>
+          <w:lang w:val="en-GB"/>
+        </w:rPr>
+        <w:t>time, and</w:t>
+      </w:r>
+      <w:proofErr w:type="gramEnd"/>
+      <w:r>
+        <w:rPr>
+          <w:i/>
+          <w:iCs/>
+          <w:lang w:val="en-GB"/>
+        </w:rPr>
+        <w:t xml:space="preserve"> simply run.”</w:t>
       </w:r>
     </w:p>
     <w:p>
@@ -2407,11 +5378,19 @@
           <w:lang w:val="en-GB"/>
         </w:rPr>
       </w:pPr>
-      <w:r>
-        <w:rPr>
-          <w:lang w:val="en-GB"/>
-        </w:rPr>
-        <w:t>Granicz describes how this ongoing mental map of points where the handler was confident in the dog’s work is used directly in real deployments:</w:t>
+      <w:proofErr w:type="spellStart"/>
+      <w:r>
+        <w:rPr>
+          <w:lang w:val="en-GB"/>
+        </w:rPr>
+        <w:t>Granicz</w:t>
+      </w:r>
+      <w:proofErr w:type="spellEnd"/>
+      <w:r>
+        <w:rPr>
+          <w:lang w:val="en-GB"/>
+        </w:rPr>
+        <w:t xml:space="preserve"> describes how this ongoing mental map of points where the handler was confident in the dog’s work is used directly in real deployments:</w:t>
       </w:r>
     </w:p>
     <w:p>
@@ -2428,15 +5407,25 @@
           <w:iCs/>
           <w:lang w:val="en-GB"/>
         </w:rPr>
-        <w:t>“During our deployments, it’s vital to constantly update and evaluate the mental map we keep in our heads. Exactly what route we’ve taken so far, where we’ve experienced unusual conditions. Where our dog has shown behavioural changes, how far he has confidently followed the trail and where is the point where we are no longer confident in our four-legged companion’s work. […] The mind-map allows you to make adjustments on the go and provides useful information for the head of the operation during the post-ev</w:t>
-      </w:r>
-      <w:r>
-        <w:rPr>
-          <w:i/>
-          <w:iCs/>
-          <w:lang w:val="en-GB"/>
-        </w:rPr>
-        <w:t>aluations of the tracking.”</w:t>
+        <w:t xml:space="preserve">“During our deployments, it’s vital to constantly update and evaluate the mental map we keep in our heads. Exactly what route we’ve taken so far, where we’ve experienced unusual conditions. Where our dog has shown behavioural changes, how far he has confidently followed the trail and where is the point where we are no longer confident in our four-legged companion’s work. […] The mind-map allows you to </w:t>
+      </w:r>
+      <w:proofErr w:type="gramStart"/>
+      <w:r>
+        <w:rPr>
+          <w:i/>
+          <w:iCs/>
+          <w:lang w:val="en-GB"/>
+        </w:rPr>
+        <w:t>make adjustments</w:t>
+      </w:r>
+      <w:proofErr w:type="gramEnd"/>
+      <w:r>
+        <w:rPr>
+          <w:i/>
+          <w:iCs/>
+          <w:lang w:val="en-GB"/>
+        </w:rPr>
+        <w:t xml:space="preserve"> on the go and provides useful information for the head of the operation during the post-evaluations of the tracking.”</w:t>
       </w:r>
     </w:p>
     <w:p>
@@ -2456,7 +5445,55 @@
           <w:szCs w:val="22"/>
           <w:lang w:val="en-GB"/>
         </w:rPr>
-        <w:t>(Granicz, Mantrailing Fine Tuned)</w:t>
+        <w:t>(</w:t>
+      </w:r>
+      <w:proofErr w:type="spellStart"/>
+      <w:r>
+        <w:rPr>
+          <w:i/>
+          <w:iCs/>
+          <w:color w:val="595959"/>
+          <w:sz w:val="22"/>
+          <w:szCs w:val="22"/>
+          <w:lang w:val="en-GB"/>
+        </w:rPr>
+        <w:t>Granicz</w:t>
+      </w:r>
+      <w:proofErr w:type="spellEnd"/>
+      <w:r>
+        <w:rPr>
+          <w:i/>
+          <w:iCs/>
+          <w:color w:val="595959"/>
+          <w:sz w:val="22"/>
+          <w:szCs w:val="22"/>
+          <w:lang w:val="en-GB"/>
+        </w:rPr>
+        <w:t xml:space="preserve">, </w:t>
+      </w:r>
+      <w:proofErr w:type="spellStart"/>
+      <w:r>
+        <w:rPr>
+          <w:i/>
+          <w:iCs/>
+          <w:color w:val="595959"/>
+          <w:sz w:val="22"/>
+          <w:szCs w:val="22"/>
+          <w:lang w:val="en-GB"/>
+        </w:rPr>
+        <w:t>Mantrailing</w:t>
+      </w:r>
+      <w:proofErr w:type="spellEnd"/>
+      <w:r>
+        <w:rPr>
+          <w:i/>
+          <w:iCs/>
+          <w:color w:val="595959"/>
+          <w:sz w:val="22"/>
+          <w:szCs w:val="22"/>
+          <w:lang w:val="en-GB"/>
+        </w:rPr>
+        <w:t xml:space="preserve"> Fine Tuned)</w:t>
       </w:r>
     </w:p>
     <w:p>
@@ -2466,11 +5503,19 @@
           <w:lang w:val="en-GB"/>
         </w:rPr>
       </w:pPr>
-      <w:r>
-        <w:rPr>
-          <w:lang w:val="en-GB"/>
-        </w:rPr>
-        <w:t>Granicz further describes a case where it was precisely the logging of points where the dog changed behaviour that led to finding a missing woman alive in a grove — even after the dog had previously indicated the end of the trail. He also explains why this information is valuable to the operations commander:</w:t>
+      <w:proofErr w:type="spellStart"/>
+      <w:r>
+        <w:rPr>
+          <w:lang w:val="en-GB"/>
+        </w:rPr>
+        <w:t>Granicz</w:t>
+      </w:r>
+      <w:proofErr w:type="spellEnd"/>
+      <w:r>
+        <w:rPr>
+          <w:lang w:val="en-GB"/>
+        </w:rPr>
+        <w:t xml:space="preserve"> further describes a case where it was precisely the logging of points where the dog changed behaviour that led to finding a missing woman alive in a grove — even after the dog had previously indicated the end of the trail. He also explains why this information is valuable to the operations commander:</w:t>
       </w:r>
     </w:p>
     <w:p>
@@ -2487,15 +5532,25 @@
           <w:iCs/>
           <w:lang w:val="en-GB"/>
         </w:rPr>
-        <w:t>“Also typical of these two applications is the possibility for the dog handler to ask the flanker to place so-called markers on the map. These points are placed where the dog is moving along the track without stopping, but the handler notices a change in the dog’s behaviour. Sometimes a dog may not stop at a critical point for some reason, but its reaction may suggest that if the tracking fails, it is worth returning to that point and scanning the surrounding area with a mantrailer or an air scent dog. We h</w:t>
-      </w:r>
-      <w:r>
-        <w:rPr>
-          <w:i/>
-          <w:iCs/>
-          <w:lang w:val="en-GB"/>
-        </w:rPr>
-        <w:t>ave already found missing persons in this way.”</w:t>
+        <w:t xml:space="preserve">“Also typical of these two applications is the possibility for the dog handler to ask the flanker to place so-called markers on the map. These points are placed where the dog is moving along the track without stopping, but the handler notices a change in the dog’s behaviour. Sometimes a dog may not stop at a critical point for some reason, but its reaction may suggest that if the tracking fails, it is worth returning to that point and scanning the surrounding area with a </w:t>
+      </w:r>
+      <w:proofErr w:type="spellStart"/>
+      <w:r>
+        <w:rPr>
+          <w:i/>
+          <w:iCs/>
+          <w:lang w:val="en-GB"/>
+        </w:rPr>
+        <w:t>mantrailer</w:t>
+      </w:r>
+      <w:proofErr w:type="spellEnd"/>
+      <w:r>
+        <w:rPr>
+          <w:i/>
+          <w:iCs/>
+          <w:lang w:val="en-GB"/>
+        </w:rPr>
+        <w:t xml:space="preserve"> or an air scent dog. We have already found missing persons in this way.”</w:t>
       </w:r>
     </w:p>
     <w:p>
@@ -2515,7 +5570,55 @@
           <w:szCs w:val="22"/>
           <w:lang w:val="en-GB"/>
         </w:rPr>
-        <w:t>(Granicz, Mantrailing Fine Tuned)</w:t>
+        <w:t>(</w:t>
+      </w:r>
+      <w:proofErr w:type="spellStart"/>
+      <w:r>
+        <w:rPr>
+          <w:i/>
+          <w:iCs/>
+          <w:color w:val="595959"/>
+          <w:sz w:val="22"/>
+          <w:szCs w:val="22"/>
+          <w:lang w:val="en-GB"/>
+        </w:rPr>
+        <w:t>Granicz</w:t>
+      </w:r>
+      <w:proofErr w:type="spellEnd"/>
+      <w:r>
+        <w:rPr>
+          <w:i/>
+          <w:iCs/>
+          <w:color w:val="595959"/>
+          <w:sz w:val="22"/>
+          <w:szCs w:val="22"/>
+          <w:lang w:val="en-GB"/>
+        </w:rPr>
+        <w:t xml:space="preserve">, </w:t>
+      </w:r>
+      <w:proofErr w:type="spellStart"/>
+      <w:r>
+        <w:rPr>
+          <w:i/>
+          <w:iCs/>
+          <w:color w:val="595959"/>
+          <w:sz w:val="22"/>
+          <w:szCs w:val="22"/>
+          <w:lang w:val="en-GB"/>
+        </w:rPr>
+        <w:t>Mantrailing</w:t>
+      </w:r>
+      <w:proofErr w:type="spellEnd"/>
+      <w:r>
+        <w:rPr>
+          <w:i/>
+          <w:iCs/>
+          <w:color w:val="595959"/>
+          <w:sz w:val="22"/>
+          <w:szCs w:val="22"/>
+          <w:lang w:val="en-GB"/>
+        </w:rPr>
+        <w:t xml:space="preserve"> Fine Tuned)</w:t>
       </w:r>
     </w:p>
     <w:p>
@@ -2546,15 +5649,16 @@
           <w:iCs/>
           <w:lang w:val="en-GB"/>
         </w:rPr>
-        <w:t xml:space="preserve">“A dog team’s success is determined: 90 % by the dog’s ability, 10 % by the handler’s ability. Because of </w:t>
-      </w:r>
-      <w:r>
-        <w:rPr>
-          <w:i/>
-          <w:iCs/>
-          <w:lang w:val="en-GB"/>
-        </w:rPr>
-        <w:t>that 10 %, you need to practice helping your dog. […] One common weakness displayed by dog handlers is the inability to react when their dog loses the trail. […] By reading the negative indications you will have a general idea where the dog last had the scent.”</w:t>
+        <w:t xml:space="preserve">“A dog team’s success is determined: 90 % by the dog’s ability, 10 % by the handler’s ability. Because of that 10 %, you need to practice helping your dog. […] One common weakness displayed by dog handlers is the inability to react when their dog loses the </w:t>
+      </w:r>
+      <w:r>
+        <w:rPr>
+          <w:i/>
+          <w:iCs/>
+          <w:lang w:val="en-GB"/>
+        </w:rPr>
+        <w:lastRenderedPageBreak/>
+        <w:t>trail. […] By reading the negative indications you will have a general idea where the dog last had the scent.”</w:t>
       </w:r>
     </w:p>
     <w:p>
@@ -2588,7 +5692,6 @@
         <w:rPr>
           <w:lang w:val="en-GB"/>
         </w:rPr>
-        <w:lastRenderedPageBreak/>
         <w:t>Ongoing calling as a quality measure, not merely a count of reported points</w:t>
       </w:r>
     </w:p>
@@ -2603,7 +5706,21 @@
         <w:rPr>
           <w:lang w:val="en-GB"/>
         </w:rPr>
-        <w:t>The scoring system rewards handlers who read their dog consistently throughout the entire trail — not only those who call one or two checkpoints just before the end. This approach derives directly from how Granicz describes fieldwork:</w:t>
+        <w:t xml:space="preserve">The scoring system rewards handlers who read their dog consistently throughout the entire trail — not only those who call one or two checkpoints just before the end. This approach derives directly from how </w:t>
+      </w:r>
+      <w:proofErr w:type="spellStart"/>
+      <w:r>
+        <w:rPr>
+          <w:lang w:val="en-GB"/>
+        </w:rPr>
+        <w:t>Granicz</w:t>
+      </w:r>
+      <w:proofErr w:type="spellEnd"/>
+      <w:r>
+        <w:rPr>
+          <w:lang w:val="en-GB"/>
+        </w:rPr>
+        <w:t xml:space="preserve"> describes fieldwork:</w:t>
       </w:r>
     </w:p>
     <w:p>
@@ -2640,7 +5757,55 @@
           <w:szCs w:val="22"/>
           <w:lang w:val="en-GB"/>
         </w:rPr>
-        <w:t>(Granicz, Mantrailing Fine Tuned)</w:t>
+        <w:t>(</w:t>
+      </w:r>
+      <w:proofErr w:type="spellStart"/>
+      <w:r>
+        <w:rPr>
+          <w:i/>
+          <w:iCs/>
+          <w:color w:val="595959"/>
+          <w:sz w:val="22"/>
+          <w:szCs w:val="22"/>
+          <w:lang w:val="en-GB"/>
+        </w:rPr>
+        <w:t>Granicz</w:t>
+      </w:r>
+      <w:proofErr w:type="spellEnd"/>
+      <w:r>
+        <w:rPr>
+          <w:i/>
+          <w:iCs/>
+          <w:color w:val="595959"/>
+          <w:sz w:val="22"/>
+          <w:szCs w:val="22"/>
+          <w:lang w:val="en-GB"/>
+        </w:rPr>
+        <w:t xml:space="preserve">, </w:t>
+      </w:r>
+      <w:proofErr w:type="spellStart"/>
+      <w:r>
+        <w:rPr>
+          <w:i/>
+          <w:iCs/>
+          <w:color w:val="595959"/>
+          <w:sz w:val="22"/>
+          <w:szCs w:val="22"/>
+          <w:lang w:val="en-GB"/>
+        </w:rPr>
+        <w:t>Mantrailing</w:t>
+      </w:r>
+      <w:proofErr w:type="spellEnd"/>
+      <w:r>
+        <w:rPr>
+          <w:i/>
+          <w:iCs/>
+          <w:color w:val="595959"/>
+          <w:sz w:val="22"/>
+          <w:szCs w:val="22"/>
+          <w:lang w:val="en-GB"/>
+        </w:rPr>
+        <w:t xml:space="preserve"> Fine Tuned)</w:t>
       </w:r>
     </w:p>
     <w:p>
@@ -2695,7 +5860,21 @@
         <w:rPr>
           <w:lang w:val="en-GB"/>
         </w:rPr>
-        <w:t>the handler’s ability to consistently and reliably identify when the dog is working on trail — a competency that the entire expert consensus (Satora, Schettler, Granicz, Kocher) regards as the handler’s primary task.</w:t>
+        <w:t>the handler’s ability to consistently and reliably identify when the dog is working on trail — a competency that the entire expert consensus (</w:t>
+      </w:r>
+      <w:proofErr w:type="spellStart"/>
+      <w:r>
+        <w:rPr>
+          <w:lang w:val="en-GB"/>
+        </w:rPr>
+        <w:t>Satora</w:t>
+      </w:r>
+      <w:proofErr w:type="spellEnd"/>
+      <w:r>
+        <w:rPr>
+          <w:lang w:val="en-GB"/>
+        </w:rPr>
+        <w:t>, Schettler, Granicz, Kocher) regards as the handler’s primary task.</w:t>
       </w:r>
     </w:p>
     <w:p>
@@ -2722,7 +5901,21 @@
         <w:rPr>
           <w:lang w:val="en-GB"/>
         </w:rPr>
-        <w:t>continuous dog-reading throughout the trail, not merely a chance match at the end — exactly as Granicz describes a functional mental map in a live deployment.</w:t>
+        <w:t xml:space="preserve">continuous dog-reading throughout the trail, not merely a chance match at the end — exactly as </w:t>
+      </w:r>
+      <w:proofErr w:type="spellStart"/>
+      <w:r>
+        <w:rPr>
+          <w:lang w:val="en-GB"/>
+        </w:rPr>
+        <w:t>Granicz</w:t>
+      </w:r>
+      <w:proofErr w:type="spellEnd"/>
+      <w:r>
+        <w:rPr>
+          <w:lang w:val="en-GB"/>
+        </w:rPr>
+        <w:t xml:space="preserve"> describes a functional mental map in a live deployment.</w:t>
       </w:r>
     </w:p>
     <w:p>
@@ -2826,7 +6019,227 @@
           <w:sz w:val="20"/>
           <w:szCs w:val="20"/>
         </w:rPr>
-        <w:t xml:space="preserve"> Detailed justification of criteria: see section "Expert Justification of Evaluation Criteria."</w:t>
+        <w:t xml:space="preserve"> </w:t>
+      </w:r>
+      <w:proofErr w:type="spellStart"/>
+      <w:r>
+        <w:rPr>
+          <w:i/>
+          <w:iCs/>
+          <w:color w:val="595959"/>
+          <w:sz w:val="20"/>
+          <w:szCs w:val="20"/>
+        </w:rPr>
+        <w:t>Detailed</w:t>
+      </w:r>
+      <w:proofErr w:type="spellEnd"/>
+      <w:r>
+        <w:rPr>
+          <w:i/>
+          <w:iCs/>
+          <w:color w:val="595959"/>
+          <w:sz w:val="20"/>
+          <w:szCs w:val="20"/>
+        </w:rPr>
+        <w:t xml:space="preserve"> </w:t>
+      </w:r>
+      <w:proofErr w:type="spellStart"/>
+      <w:r>
+        <w:rPr>
+          <w:i/>
+          <w:iCs/>
+          <w:color w:val="595959"/>
+          <w:sz w:val="20"/>
+          <w:szCs w:val="20"/>
+        </w:rPr>
+        <w:t>justification</w:t>
+      </w:r>
+      <w:proofErr w:type="spellEnd"/>
+      <w:r>
+        <w:rPr>
+          <w:i/>
+          <w:iCs/>
+          <w:color w:val="595959"/>
+          <w:sz w:val="20"/>
+          <w:szCs w:val="20"/>
+        </w:rPr>
+        <w:t xml:space="preserve"> </w:t>
+      </w:r>
+      <w:proofErr w:type="spellStart"/>
+      <w:r>
+        <w:rPr>
+          <w:i/>
+          <w:iCs/>
+          <w:color w:val="595959"/>
+          <w:sz w:val="20"/>
+          <w:szCs w:val="20"/>
+        </w:rPr>
+        <w:t>of</w:t>
+      </w:r>
+      <w:proofErr w:type="spellEnd"/>
+      <w:r>
+        <w:rPr>
+          <w:i/>
+          <w:iCs/>
+          <w:color w:val="595959"/>
+          <w:sz w:val="20"/>
+          <w:szCs w:val="20"/>
+        </w:rPr>
+        <w:t xml:space="preserve"> </w:t>
+      </w:r>
+      <w:proofErr w:type="spellStart"/>
+      <w:r>
+        <w:rPr>
+          <w:i/>
+          <w:iCs/>
+          <w:color w:val="595959"/>
+          <w:sz w:val="20"/>
+          <w:szCs w:val="20"/>
+        </w:rPr>
+        <w:t>criteria</w:t>
+      </w:r>
+      <w:proofErr w:type="spellEnd"/>
+      <w:r>
+        <w:rPr>
+          <w:i/>
+          <w:iCs/>
+          <w:color w:val="595959"/>
+          <w:sz w:val="20"/>
+          <w:szCs w:val="20"/>
+        </w:rPr>
+        <w:t xml:space="preserve">: </w:t>
+      </w:r>
+      <w:proofErr w:type="spellStart"/>
+      <w:r>
+        <w:rPr>
+          <w:i/>
+          <w:iCs/>
+          <w:color w:val="595959"/>
+          <w:sz w:val="20"/>
+          <w:szCs w:val="20"/>
+        </w:rPr>
+        <w:t>see</w:t>
+      </w:r>
+      <w:proofErr w:type="spellEnd"/>
+      <w:r>
+        <w:rPr>
+          <w:i/>
+          <w:iCs/>
+          <w:color w:val="595959"/>
+          <w:sz w:val="20"/>
+          <w:szCs w:val="20"/>
+        </w:rPr>
+        <w:t xml:space="preserve"> </w:t>
+      </w:r>
+      <w:proofErr w:type="spellStart"/>
+      <w:r>
+        <w:rPr>
+          <w:i/>
+          <w:iCs/>
+          <w:color w:val="595959"/>
+          <w:sz w:val="20"/>
+          <w:szCs w:val="20"/>
+        </w:rPr>
+        <w:t>section</w:t>
+      </w:r>
+      <w:proofErr w:type="spellEnd"/>
+      <w:r>
+        <w:rPr>
+          <w:i/>
+          <w:iCs/>
+          <w:color w:val="595959"/>
+          <w:sz w:val="20"/>
+          <w:szCs w:val="20"/>
+        </w:rPr>
+        <w:t xml:space="preserve"> "Expert </w:t>
+      </w:r>
+      <w:proofErr w:type="spellStart"/>
+      <w:r>
+        <w:rPr>
+          <w:i/>
+          <w:iCs/>
+          <w:color w:val="595959"/>
+          <w:sz w:val="20"/>
+          <w:szCs w:val="20"/>
+        </w:rPr>
+        <w:t>Justification</w:t>
+      </w:r>
+      <w:proofErr w:type="spellEnd"/>
+      <w:r>
+        <w:rPr>
+          <w:i/>
+          <w:iCs/>
+          <w:color w:val="595959"/>
+          <w:sz w:val="20"/>
+          <w:szCs w:val="20"/>
+        </w:rPr>
+        <w:t xml:space="preserve"> </w:t>
+      </w:r>
+      <w:proofErr w:type="spellStart"/>
+      <w:r>
+        <w:rPr>
+          <w:i/>
+          <w:iCs/>
+          <w:color w:val="595959"/>
+          <w:sz w:val="20"/>
+          <w:szCs w:val="20"/>
+        </w:rPr>
+        <w:t>of</w:t>
+      </w:r>
+      <w:proofErr w:type="spellEnd"/>
+      <w:r>
+        <w:rPr>
+          <w:i/>
+          <w:iCs/>
+          <w:color w:val="595959"/>
+          <w:sz w:val="20"/>
+          <w:szCs w:val="20"/>
+        </w:rPr>
+        <w:t xml:space="preserve"> </w:t>
+      </w:r>
+      <w:proofErr w:type="spellStart"/>
+      <w:r>
+        <w:rPr>
+          <w:i/>
+          <w:iCs/>
+          <w:color w:val="595959"/>
+          <w:sz w:val="20"/>
+          <w:szCs w:val="20"/>
+        </w:rPr>
+        <w:t>Evaluation</w:t>
+      </w:r>
+      <w:proofErr w:type="spellEnd"/>
+      <w:r>
+        <w:rPr>
+          <w:i/>
+          <w:iCs/>
+          <w:color w:val="595959"/>
+          <w:sz w:val="20"/>
+          <w:szCs w:val="20"/>
+        </w:rPr>
+        <w:t xml:space="preserve"> </w:t>
+      </w:r>
+      <w:proofErr w:type="spellStart"/>
+      <w:r>
+        <w:rPr>
+          <w:i/>
+          <w:iCs/>
+          <w:color w:val="595959"/>
+          <w:sz w:val="20"/>
+          <w:szCs w:val="20"/>
+        </w:rPr>
+        <w:t>Criteria</w:t>
+      </w:r>
+      <w:proofErr w:type="spellEnd"/>
+      <w:r>
+        <w:rPr>
+          <w:i/>
+          <w:iCs/>
+          <w:color w:val="595959"/>
+          <w:sz w:val="20"/>
+          <w:szCs w:val="20"/>
+        </w:rPr>
+        <w:t>."</w:t>
       </w:r>
     </w:p>
     <w:p>

</xml_diff>